<commit_message>
feat: refactor into human-reviewed monthly report agent
</commit_message>
<xml_diff>
--- a/src/main/resources/templates/monthly_report_template.docx
+++ b/src/main/resources/templates/monthly_report_template.docx
@@ -87,7 +87,7 @@
           <w:sz w:val="32"/>
           <w:szCs w:val="32"/>
         </w:rPr>
-        <w:t>（</w:t>
+        <w:t>（{{REPORT_YEAR}}年第{{ISSUE_NO}}期，总第{{TOTAL_ISSUE_NO}}期）</w:t>
       </w:r>
       <w:r>
         <w:rPr>
@@ -97,7 +97,7 @@
           <w:sz w:val="32"/>
           <w:szCs w:val="32"/>
         </w:rPr>
-        <w:t>202</w:t>
+        <w:t/>
       </w:r>
       <w:r>
         <w:rPr>
@@ -107,7 +107,7 @@
           <w:sz w:val="32"/>
           <w:szCs w:val="32"/>
         </w:rPr>
-        <w:t>6</w:t>
+        <w:t/>
       </w:r>
       <w:r>
         <w:rPr>
@@ -117,7 +117,7 @@
           <w:sz w:val="32"/>
           <w:szCs w:val="32"/>
         </w:rPr>
-        <w:t>年第</w:t>
+        <w:t/>
       </w:r>
       <w:r>
         <w:rPr>
@@ -127,7 +127,7 @@
           <w:sz w:val="32"/>
           <w:szCs w:val="32"/>
         </w:rPr>
-        <w:t>1</w:t>
+        <w:t/>
       </w:r>
       <w:r>
         <w:rPr>
@@ -137,7 +137,7 @@
           <w:sz w:val="32"/>
           <w:szCs w:val="32"/>
         </w:rPr>
-        <w:t>期，总第</w:t>
+        <w:t/>
       </w:r>
       <w:r>
         <w:rPr>
@@ -147,7 +147,7 @@
           <w:sz w:val="32"/>
           <w:szCs w:val="32"/>
         </w:rPr>
-        <w:t>1</w:t>
+        <w:t/>
       </w:r>
       <w:r>
         <w:rPr>
@@ -157,7 +157,7 @@
           <w:sz w:val="32"/>
           <w:szCs w:val="32"/>
         </w:rPr>
-        <w:t>期）</w:t>
+        <w:t/>
       </w:r>
     </w:p>
     <w:p>
@@ -1397,77 +1397,77 @@
           <w:rFonts w:ascii="Times New Roman" w:eastAsia="仿宋_GB2312" w:hAnsi="Times New Roman"/>
           <w:sz w:val="32"/>
         </w:rPr>
-        <w:t>【写作格式】采用</w:t>
-      </w:r>
-      <w:r>
-        <w:rPr>
-          <w:rFonts w:ascii="Times New Roman" w:eastAsia="仿宋_GB2312" w:hAnsi="Times New Roman"/>
-          <w:sz w:val="32"/>
-        </w:rPr>
-        <w:t>“</w:t>
-      </w:r>
-      <w:r>
-        <w:rPr>
-          <w:rFonts w:ascii="Times New Roman" w:eastAsia="仿宋_GB2312" w:hAnsi="Times New Roman"/>
-          <w:sz w:val="32"/>
-        </w:rPr>
-        <w:t>总体情况</w:t>
-      </w:r>
-      <w:r>
-        <w:rPr>
-          <w:rFonts w:ascii="Times New Roman" w:eastAsia="仿宋_GB2312" w:hAnsi="Times New Roman"/>
-          <w:sz w:val="32"/>
-        </w:rPr>
-        <w:t>+</w:t>
-      </w:r>
-      <w:r>
-        <w:rPr>
-          <w:rFonts w:ascii="Times New Roman" w:eastAsia="仿宋_GB2312" w:hAnsi="Times New Roman"/>
-          <w:sz w:val="32"/>
-        </w:rPr>
-        <w:t>指标进展</w:t>
-      </w:r>
-      <w:r>
-        <w:rPr>
-          <w:rFonts w:ascii="Times New Roman" w:eastAsia="仿宋_GB2312" w:hAnsi="Times New Roman"/>
-          <w:sz w:val="32"/>
-        </w:rPr>
-        <w:t>+</w:t>
-      </w:r>
-      <w:r>
-        <w:rPr>
-          <w:rFonts w:ascii="Times New Roman" w:eastAsia="仿宋_GB2312" w:hAnsi="Times New Roman"/>
-          <w:sz w:val="32"/>
-        </w:rPr>
-        <w:t>问题帮扶</w:t>
-      </w:r>
-      <w:r>
-        <w:rPr>
-          <w:rFonts w:ascii="Times New Roman" w:eastAsia="仿宋_GB2312" w:hAnsi="Times New Roman"/>
-          <w:sz w:val="32"/>
-        </w:rPr>
-        <w:t>+</w:t>
-      </w:r>
-      <w:r>
-        <w:rPr>
-          <w:rFonts w:ascii="Times New Roman" w:eastAsia="仿宋_GB2312" w:hAnsi="Times New Roman"/>
-          <w:sz w:val="32"/>
-        </w:rPr>
-        <w:t>典型经验</w:t>
-      </w:r>
-      <w:r>
-        <w:rPr>
-          <w:rFonts w:ascii="Times New Roman" w:eastAsia="仿宋_GB2312" w:hAnsi="Times New Roman"/>
-          <w:sz w:val="32"/>
-        </w:rPr>
-        <w:t>”</w:t>
-      </w:r>
-      <w:r>
-        <w:rPr>
-          <w:rFonts w:ascii="Times New Roman" w:eastAsia="仿宋_GB2312" w:hAnsi="Times New Roman"/>
-          <w:sz w:val="32"/>
-        </w:rPr>
-        <w:t>的结构，并与附件进度统计表保持一致。</w:t>
+        <w:t>【写作格式】采用“总体情况+指标进展+问题帮扶+典型经验”的结构。</w:t>
+      </w:r>
+      <w:r>
+        <w:rPr>
+          <w:rFonts w:ascii="Times New Roman" w:eastAsia="仿宋_GB2312" w:hAnsi="Times New Roman"/>
+          <w:sz w:val="32"/>
+        </w:rPr>
+        <w:t/>
+      </w:r>
+      <w:r>
+        <w:rPr>
+          <w:rFonts w:ascii="Times New Roman" w:eastAsia="仿宋_GB2312" w:hAnsi="Times New Roman"/>
+          <w:sz w:val="32"/>
+        </w:rPr>
+        <w:t/>
+      </w:r>
+      <w:r>
+        <w:rPr>
+          <w:rFonts w:ascii="Times New Roman" w:eastAsia="仿宋_GB2312" w:hAnsi="Times New Roman"/>
+          <w:sz w:val="32"/>
+        </w:rPr>
+        <w:t/>
+      </w:r>
+      <w:r>
+        <w:rPr>
+          <w:rFonts w:ascii="Times New Roman" w:eastAsia="仿宋_GB2312" w:hAnsi="Times New Roman"/>
+          <w:sz w:val="32"/>
+        </w:rPr>
+        <w:t/>
+      </w:r>
+      <w:r>
+        <w:rPr>
+          <w:rFonts w:ascii="Times New Roman" w:eastAsia="仿宋_GB2312" w:hAnsi="Times New Roman"/>
+          <w:sz w:val="32"/>
+        </w:rPr>
+        <w:t/>
+      </w:r>
+      <w:r>
+        <w:rPr>
+          <w:rFonts w:ascii="Times New Roman" w:eastAsia="仿宋_GB2312" w:hAnsi="Times New Roman"/>
+          <w:sz w:val="32"/>
+        </w:rPr>
+        <w:t/>
+      </w:r>
+      <w:r>
+        <w:rPr>
+          <w:rFonts w:ascii="Times New Roman" w:eastAsia="仿宋_GB2312" w:hAnsi="Times New Roman"/>
+          <w:sz w:val="32"/>
+        </w:rPr>
+        <w:t/>
+      </w:r>
+      <w:r>
+        <w:rPr>
+          <w:rFonts w:ascii="Times New Roman" w:eastAsia="仿宋_GB2312" w:hAnsi="Times New Roman"/>
+          <w:sz w:val="32"/>
+        </w:rPr>
+        <w:t/>
+      </w:r>
+      <w:r>
+        <w:rPr>
+          <w:rFonts w:ascii="Times New Roman" w:eastAsia="仿宋_GB2312" w:hAnsi="Times New Roman"/>
+          <w:sz w:val="32"/>
+        </w:rPr>
+        <w:t/>
+      </w:r>
+      <w:r>
+        <w:rPr>
+          <w:rFonts w:ascii="Times New Roman" w:eastAsia="仿宋_GB2312" w:hAnsi="Times New Roman"/>
+          <w:sz w:val="32"/>
+        </w:rPr>
+        <w:t/>
       </w:r>
     </w:p>
     <w:p>
@@ -1594,6 +1594,23 @@
       <w:pPr>
         <w:spacing w:after="100" w:afterAutospacing="1" w:line="560" w:lineRule="exact"/>
         <w:ind w:firstLineChars="200" w:firstLine="640"/>
+        <w:rPr>
+          <w:rFonts w:ascii="Times New Roman" w:eastAsia="仿宋_GB2312" w:hAnsi="Times New Roman"/>
+          <w:sz w:val="32"/>
+        </w:rPr>
+      </w:pPr>
+      <w:r>
+        <w:rPr>
+          <w:rFonts w:ascii="Times New Roman" w:eastAsia="仿宋_GB2312" w:hAnsi="Times New Roman"/>
+          <w:sz w:val="32"/>
+        </w:rPr>
+        <w:t>{{SECTION_PIONEER_OVERALL}}</w:t>
+      </w:r>
+    </w:p>
+    <w:p>
+      <w:pPr>
+        <w:spacing w:after="100" w:afterAutospacing="1" w:line="560" w:lineRule="exact"/>
+        <w:ind w:firstLineChars="200" w:firstLine="640"/>
         <w:outlineLvl w:val="1"/>
         <w:rPr>
           <w:rFonts w:ascii="Times New Roman" w:eastAsia="楷体_GB2312" w:hAnsi="Times New Roman" w:cs="Times New Roman"/>
@@ -1624,49 +1641,49 @@
           <w:rFonts w:ascii="Times New Roman" w:eastAsia="仿宋_GB2312" w:hAnsi="Times New Roman"/>
           <w:sz w:val="32"/>
         </w:rPr>
-        <w:t>【预期内容】截至</w:t>
-      </w:r>
-      <w:r>
-        <w:rPr>
-          <w:rFonts w:ascii="Times New Roman" w:eastAsia="仿宋_GB2312" w:hAnsi="Times New Roman"/>
-          <w:sz w:val="32"/>
-        </w:rPr>
-        <w:t>X</w:t>
-      </w:r>
-      <w:r>
-        <w:rPr>
-          <w:rFonts w:ascii="Times New Roman" w:eastAsia="仿宋_GB2312" w:hAnsi="Times New Roman"/>
-          <w:sz w:val="32"/>
-        </w:rPr>
-        <w:t>月</w:t>
-      </w:r>
-      <w:r>
-        <w:rPr>
-          <w:rFonts w:ascii="Times New Roman" w:eastAsia="仿宋_GB2312" w:hAnsi="Times New Roman"/>
-          <w:sz w:val="32"/>
-        </w:rPr>
-        <w:t>X</w:t>
-      </w:r>
-      <w:r>
-        <w:rPr>
-          <w:rFonts w:ascii="Times New Roman" w:eastAsia="仿宋_GB2312" w:hAnsi="Times New Roman"/>
-          <w:sz w:val="32"/>
-        </w:rPr>
-        <w:t>日，核心指标总体完成率为</w:t>
-      </w:r>
-      <w:r>
-        <w:rPr>
-          <w:rFonts w:ascii="Times New Roman" w:eastAsia="仿宋_GB2312" w:hAnsi="Times New Roman"/>
-          <w:sz w:val="32"/>
-        </w:rPr>
-        <w:t>XX%</w:t>
-      </w:r>
-      <w:r>
-        <w:rPr>
-          <w:rFonts w:ascii="Times New Roman" w:eastAsia="仿宋_GB2312" w:hAnsi="Times New Roman"/>
-          <w:sz w:val="32"/>
-        </w:rPr>
-        <w:t>。</w:t>
+        <w:t>【预期内容】截至X月X日，核心指标总体完成率为XX%。规上企业改造、营收过亿元企业人工智能普及、DCMM贯标、产品培育等指标完成情况</w:t>
+      </w:r>
+      <w:r>
+        <w:rPr>
+          <w:rFonts w:ascii="Times New Roman" w:eastAsia="仿宋_GB2312" w:hAnsi="Times New Roman"/>
+          <w:sz w:val="32"/>
+        </w:rPr>
+        <w:t/>
+      </w:r>
+      <w:r>
+        <w:rPr>
+          <w:rFonts w:ascii="Times New Roman" w:eastAsia="仿宋_GB2312" w:hAnsi="Times New Roman"/>
+          <w:sz w:val="32"/>
+        </w:rPr>
+        <w:t/>
+      </w:r>
+      <w:r>
+        <w:rPr>
+          <w:rFonts w:ascii="Times New Roman" w:eastAsia="仿宋_GB2312" w:hAnsi="Times New Roman"/>
+          <w:sz w:val="32"/>
+        </w:rPr>
+        <w:t/>
+      </w:r>
+      <w:r>
+        <w:rPr>
+          <w:rFonts w:ascii="Times New Roman" w:eastAsia="仿宋_GB2312" w:hAnsi="Times New Roman"/>
+          <w:sz w:val="32"/>
+        </w:rPr>
+        <w:t/>
+      </w:r>
+      <w:r>
+        <w:rPr>
+          <w:rFonts w:ascii="Times New Roman" w:eastAsia="仿宋_GB2312" w:hAnsi="Times New Roman"/>
+          <w:sz w:val="32"/>
+        </w:rPr>
+        <w:t/>
+      </w:r>
+      <w:r>
+        <w:rPr>
+          <w:rFonts w:ascii="Times New Roman" w:eastAsia="仿宋_GB2312" w:hAnsi="Times New Roman"/>
+          <w:sz w:val="32"/>
+        </w:rPr>
+        <w:t/>
       </w:r>
       <w:proofErr w:type="gramStart"/>
       <w:r>
@@ -1674,7 +1691,7 @@
           <w:rFonts w:ascii="Times New Roman" w:eastAsia="仿宋_GB2312" w:hAnsi="Times New Roman"/>
           <w:sz w:val="32"/>
         </w:rPr>
-        <w:t>规</w:t>
+        <w:t/>
       </w:r>
       <w:proofErr w:type="gramEnd"/>
       <w:r>
@@ -1682,35 +1699,52 @@
           <w:rFonts w:ascii="Times New Roman" w:eastAsia="仿宋_GB2312" w:hAnsi="Times New Roman"/>
           <w:sz w:val="32"/>
         </w:rPr>
-        <w:t>上企业改造、营收过亿元企业人工智能普及、</w:t>
-      </w:r>
-      <w:r>
-        <w:rPr>
-          <w:rFonts w:ascii="Times New Roman" w:eastAsia="仿宋_GB2312" w:hAnsi="Times New Roman"/>
-          <w:sz w:val="32"/>
-        </w:rPr>
-        <w:t>DCMM</w:t>
-      </w:r>
-      <w:r>
-        <w:rPr>
-          <w:rFonts w:ascii="Times New Roman" w:eastAsia="仿宋_GB2312" w:hAnsi="Times New Roman"/>
-          <w:sz w:val="32"/>
-        </w:rPr>
-        <w:t>贯标、产品培育等指标完成情况详见附件</w:t>
-      </w:r>
-      <w:r>
-        <w:rPr>
-          <w:rFonts w:ascii="Times New Roman" w:eastAsia="仿宋_GB2312" w:hAnsi="Times New Roman"/>
-          <w:sz w:val="32"/>
-        </w:rPr>
-        <w:t>1</w:t>
-      </w:r>
-      <w:r>
-        <w:rPr>
-          <w:rFonts w:ascii="Times New Roman" w:eastAsia="仿宋_GB2312" w:hAnsi="Times New Roman"/>
-          <w:sz w:val="32"/>
-        </w:rPr>
-        <w:t>。</w:t>
+        <w:t/>
+      </w:r>
+      <w:r>
+        <w:rPr>
+          <w:rFonts w:ascii="Times New Roman" w:eastAsia="仿宋_GB2312" w:hAnsi="Times New Roman"/>
+          <w:sz w:val="32"/>
+        </w:rPr>
+        <w:t/>
+      </w:r>
+      <w:r>
+        <w:rPr>
+          <w:rFonts w:ascii="Times New Roman" w:eastAsia="仿宋_GB2312" w:hAnsi="Times New Roman"/>
+          <w:sz w:val="32"/>
+        </w:rPr>
+        <w:t/>
+      </w:r>
+      <w:r>
+        <w:rPr>
+          <w:rFonts w:ascii="Times New Roman" w:eastAsia="仿宋_GB2312" w:hAnsi="Times New Roman"/>
+          <w:sz w:val="32"/>
+        </w:rPr>
+        <w:t/>
+      </w:r>
+      <w:r>
+        <w:rPr>
+          <w:rFonts w:ascii="Times New Roman" w:eastAsia="仿宋_GB2312" w:hAnsi="Times New Roman"/>
+          <w:sz w:val="32"/>
+        </w:rPr>
+        <w:t/>
+      </w:r>
+    </w:p>
+    <w:p>
+      <w:pPr>
+        <w:spacing w:after="100" w:afterAutospacing="1" w:line="560" w:lineRule="exact"/>
+        <w:ind w:firstLineChars="200" w:firstLine="640"/>
+        <w:rPr>
+          <w:rFonts w:ascii="Times New Roman" w:eastAsia="仿宋_GB2312" w:hAnsi="Times New Roman"/>
+          <w:sz w:val="32"/>
+        </w:rPr>
+      </w:pPr>
+      <w:r>
+        <w:rPr>
+          <w:rFonts w:ascii="Times New Roman" w:eastAsia="仿宋_GB2312" w:hAnsi="Times New Roman"/>
+          <w:sz w:val="32"/>
+        </w:rPr>
+        <w:t>{{SECTION_PIONEER_INDICATORS}}</w:t>
       </w:r>
     </w:p>
     <w:p>
@@ -1800,6 +1834,23 @@
       <w:pPr>
         <w:spacing w:after="100" w:afterAutospacing="1" w:line="560" w:lineRule="exact"/>
         <w:ind w:firstLineChars="200" w:firstLine="640"/>
+        <w:rPr>
+          <w:rFonts w:ascii="Times New Roman" w:eastAsia="仿宋_GB2312" w:hAnsi="Times New Roman"/>
+          <w:sz w:val="32"/>
+        </w:rPr>
+      </w:pPr>
+      <w:r>
+        <w:rPr>
+          <w:rFonts w:ascii="Times New Roman" w:eastAsia="仿宋_GB2312" w:hAnsi="Times New Roman"/>
+          <w:sz w:val="32"/>
+        </w:rPr>
+        <w:t>{{SECTION_PIONEER_SUPPORT}}</w:t>
+      </w:r>
+    </w:p>
+    <w:p>
+      <w:pPr>
+        <w:spacing w:after="100" w:afterAutospacing="1" w:line="560" w:lineRule="exact"/>
+        <w:ind w:firstLineChars="200" w:firstLine="640"/>
         <w:outlineLvl w:val="1"/>
         <w:rPr>
           <w:rFonts w:ascii="Times New Roman" w:eastAsia="楷体_GB2312" w:hAnsi="Times New Roman" w:cs="Times New Roman"/>
@@ -1958,6 +2009,23 @@
           <w:sz w:val="32"/>
         </w:rPr>
         <w:t>能力。后续可从全省复制推广、行业示范和资源共享角度持续跟踪。</w:t>
+      </w:r>
+    </w:p>
+    <w:p>
+      <w:pPr>
+        <w:spacing w:after="100" w:afterAutospacing="1" w:line="560" w:lineRule="exact"/>
+        <w:ind w:firstLineChars="200" w:firstLine="640"/>
+        <w:rPr>
+          <w:rFonts w:ascii="Times New Roman" w:eastAsia="仿宋_GB2312" w:hAnsi="Times New Roman"/>
+          <w:sz w:val="32"/>
+        </w:rPr>
+      </w:pPr>
+      <w:r>
+        <w:rPr>
+          <w:rFonts w:ascii="Times New Roman" w:eastAsia="仿宋_GB2312" w:hAnsi="Times New Roman"/>
+          <w:sz w:val="32"/>
+        </w:rPr>
+        <w:t>{{SECTION_PIONEER_EXPERIENCE}}</w:t>
       </w:r>
     </w:p>
     <w:p>
@@ -2258,2777 +2326,6 @@
         <w:br w:type="page"/>
       </w:r>
     </w:p>
-    <w:p>
-      <w:pPr>
-        <w:spacing w:line="560" w:lineRule="exact"/>
-        <w:ind w:leftChars="-400" w:left="-840" w:rightChars="-353" w:right="-741"/>
-        <w:jc w:val="left"/>
-        <w:rPr>
-          <w:rFonts w:ascii="黑体" w:eastAsia="黑体" w:hAnsi="黑体" w:cs="黑体"/>
-          <w:sz w:val="32"/>
-          <w:szCs w:val="32"/>
-        </w:rPr>
-      </w:pPr>
-      <w:r>
-        <w:rPr>
-          <w:rFonts w:ascii="黑体" w:eastAsia="黑体" w:hAnsi="黑体" w:cs="黑体" w:hint="eastAsia"/>
-          <w:sz w:val="32"/>
-          <w:szCs w:val="32"/>
-        </w:rPr>
-        <w:lastRenderedPageBreak/>
-        <w:t>附件1</w:t>
-      </w:r>
-    </w:p>
-    <w:p>
-      <w:pPr>
-        <w:spacing w:line="560" w:lineRule="exact"/>
-        <w:jc w:val="left"/>
-        <w:rPr>
-          <w:rFonts w:ascii="黑体" w:eastAsia="仿宋_GB2312" w:hAnsi="黑体" w:cs="黑体"/>
-          <w:sz w:val="32"/>
-          <w:szCs w:val="32"/>
-        </w:rPr>
-      </w:pPr>
-      <w:r>
-        <w:rPr>
-          <w:rFonts w:ascii="Times New Roman" w:eastAsia="仿宋_GB2312" w:hAnsi="Times New Roman"/>
-          <w:sz w:val="32"/>
-        </w:rPr>
-        <w:t>【填报说明】附件用于支撑</w:t>
-      </w:r>
-      <w:r>
-        <w:rPr>
-          <w:rFonts w:ascii="Times New Roman" w:eastAsia="仿宋_GB2312" w:hAnsi="Times New Roman"/>
-          <w:sz w:val="32"/>
-        </w:rPr>
-        <w:t>“</w:t>
-      </w:r>
-      <w:r>
-        <w:rPr>
-          <w:rFonts w:ascii="Times New Roman" w:eastAsia="仿宋_GB2312" w:hAnsi="Times New Roman"/>
-          <w:sz w:val="32"/>
-        </w:rPr>
-        <w:t>先锋应用动态</w:t>
-      </w:r>
-      <w:r>
-        <w:rPr>
-          <w:rFonts w:ascii="Times New Roman" w:eastAsia="仿宋_GB2312" w:hAnsi="Times New Roman"/>
-          <w:sz w:val="32"/>
-        </w:rPr>
-        <w:t>”</w:t>
-      </w:r>
-      <w:r>
-        <w:rPr>
-          <w:rFonts w:ascii="Times New Roman" w:eastAsia="仿宋_GB2312" w:hAnsi="Times New Roman"/>
-          <w:sz w:val="32"/>
-        </w:rPr>
-        <w:t>栏目，按月更新</w:t>
-      </w:r>
-      <w:r>
-        <w:rPr>
-          <w:rFonts w:ascii="Times New Roman" w:eastAsia="仿宋_GB2312" w:hAnsi="Times New Roman" w:hint="eastAsia"/>
-          <w:sz w:val="32"/>
-        </w:rPr>
-        <w:t>。</w:t>
-      </w:r>
-    </w:p>
-    <w:p>
-      <w:pPr>
-        <w:spacing w:line="560" w:lineRule="exact"/>
-        <w:jc w:val="center"/>
-        <w:rPr>
-          <w:rFonts w:ascii="方正小标宋简体" w:eastAsia="方正小标宋简体" w:hAnsi="方正小标宋简体" w:cs="方正小标宋简体"/>
-          <w:sz w:val="32"/>
-          <w:szCs w:val="32"/>
-        </w:rPr>
-      </w:pPr>
-      <w:r>
-        <w:rPr>
-          <w:rFonts w:ascii="方正小标宋简体" w:eastAsia="方正小标宋简体" w:hAnsi="方正小标宋简体" w:cs="方正小标宋简体" w:hint="eastAsia"/>
-          <w:sz w:val="32"/>
-          <w:szCs w:val="32"/>
-        </w:rPr>
-        <w:t>山东省"人工智能+制造"先锋应用揭榜挂帅建设工作进度统计表（截止到XX年XX月XX日）</w:t>
-      </w:r>
-    </w:p>
-    <w:tbl>
-      <w:tblPr>
-        <w:tblW w:w="0" w:type="auto"/>
-        <w:jc w:val="center"/>
-        <w:tblBorders>
-          <w:top w:val="single" w:sz="4" w:space="0" w:color="auto"/>
-          <w:left w:val="single" w:sz="4" w:space="0" w:color="auto"/>
-          <w:bottom w:val="single" w:sz="4" w:space="0" w:color="auto"/>
-          <w:right w:val="single" w:sz="4" w:space="0" w:color="auto"/>
-          <w:insideH w:val="single" w:sz="4" w:space="0" w:color="auto"/>
-          <w:insideV w:val="single" w:sz="4" w:space="0" w:color="auto"/>
-        </w:tblBorders>
-        <w:tblLayout w:type="fixed"/>
-        <w:tblLook w:val="04A0" w:firstRow="1" w:lastRow="0" w:firstColumn="1" w:lastColumn="0" w:noHBand="0" w:noVBand="1"/>
-      </w:tblPr>
-      <w:tblGrid>
-        <w:gridCol w:w="538"/>
-        <w:gridCol w:w="538"/>
-        <w:gridCol w:w="961"/>
-        <w:gridCol w:w="981"/>
-        <w:gridCol w:w="747"/>
-        <w:gridCol w:w="747"/>
-        <w:gridCol w:w="790"/>
-        <w:gridCol w:w="790"/>
-        <w:gridCol w:w="771"/>
-        <w:gridCol w:w="776"/>
-        <w:gridCol w:w="768"/>
-        <w:gridCol w:w="768"/>
-        <w:gridCol w:w="768"/>
-        <w:gridCol w:w="1027"/>
-        <w:gridCol w:w="1016"/>
-        <w:gridCol w:w="903"/>
-        <w:gridCol w:w="780"/>
-        <w:gridCol w:w="504"/>
-      </w:tblGrid>
-      <w:tr>
-        <w:trPr>
-          <w:trHeight w:val="1200"/>
-          <w:tblHeader/>
-          <w:jc w:val="center"/>
-        </w:trPr>
-        <w:tc>
-          <w:tcPr>
-            <w:tcW w:w="538" w:type="dxa"/>
-            <w:vMerge w:val="restart"/>
-            <w:shd w:val="clear" w:color="auto" w:fill="auto"/>
-            <w:noWrap/>
-            <w:vAlign w:val="center"/>
-          </w:tcPr>
-          <w:p>
-            <w:pPr>
-              <w:widowControl/>
-              <w:snapToGrid w:val="0"/>
-              <w:spacing w:line="240" w:lineRule="auto"/>
-              <w:jc w:val="center"/>
-              <w:textAlignment w:val="center"/>
-              <w:rPr>
-                <w:rFonts w:ascii="仿宋" w:eastAsia="仿宋" w:hAnsi="仿宋" w:cs="仿宋"/>
-                <w:b/>
-                <w:bCs/>
-                <w:color w:val="000000"/>
-                <w:kern w:val="0"/>
-                <w:sz w:val="18"/>
-                <w:szCs w:val="18"/>
-                <w:lang w:bidi="ar"/>
-              </w:rPr>
-            </w:pPr>
-            <w:r>
-              <w:rPr>
-                <w:rFonts w:ascii="仿宋" w:eastAsia="仿宋" w:hAnsi="仿宋" w:cs="仿宋" w:hint="eastAsia"/>
-                <w:b/>
-                <w:bCs/>
-                <w:color w:val="000000"/>
-                <w:kern w:val="0"/>
-                <w:sz w:val="18"/>
-                <w:szCs w:val="18"/>
-                <w:lang w:bidi="ar"/>
-              </w:rPr>
-              <w:t>序号</w:t>
-            </w:r>
-          </w:p>
-        </w:tc>
-        <w:tc>
-          <w:tcPr>
-            <w:tcW w:w="538" w:type="dxa"/>
-            <w:vMerge w:val="restart"/>
-            <w:shd w:val="clear" w:color="auto" w:fill="auto"/>
-            <w:noWrap/>
-            <w:vAlign w:val="center"/>
-          </w:tcPr>
-          <w:p>
-            <w:pPr>
-              <w:widowControl/>
-              <w:snapToGrid w:val="0"/>
-              <w:spacing w:line="240" w:lineRule="auto"/>
-              <w:jc w:val="center"/>
-              <w:textAlignment w:val="center"/>
-              <w:rPr>
-                <w:rFonts w:ascii="仿宋" w:eastAsia="仿宋" w:hAnsi="仿宋" w:cs="仿宋"/>
-                <w:b/>
-                <w:bCs/>
-                <w:color w:val="000000"/>
-                <w:sz w:val="18"/>
-                <w:szCs w:val="18"/>
-              </w:rPr>
-            </w:pPr>
-            <w:r>
-              <w:rPr>
-                <w:rFonts w:ascii="仿宋" w:eastAsia="仿宋" w:hAnsi="仿宋" w:cs="仿宋" w:hint="eastAsia"/>
-                <w:b/>
-                <w:bCs/>
-                <w:color w:val="000000"/>
-                <w:kern w:val="0"/>
-                <w:sz w:val="18"/>
-                <w:szCs w:val="18"/>
-                <w:lang w:bidi="ar"/>
-              </w:rPr>
-              <w:t>地市</w:t>
-            </w:r>
-          </w:p>
-        </w:tc>
-        <w:tc>
-          <w:tcPr>
-            <w:tcW w:w="961" w:type="dxa"/>
-            <w:shd w:val="clear" w:color="auto" w:fill="auto"/>
-            <w:vAlign w:val="center"/>
-          </w:tcPr>
-          <w:p>
-            <w:pPr>
-              <w:snapToGrid w:val="0"/>
-              <w:spacing w:line="240" w:lineRule="auto"/>
-              <w:rPr>
-                <w:rFonts w:ascii="仿宋" w:eastAsia="仿宋" w:hAnsi="仿宋" w:cs="仿宋"/>
-                <w:color w:val="000000"/>
-                <w:sz w:val="18"/>
-                <w:szCs w:val="18"/>
-              </w:rPr>
-            </w:pPr>
-            <w:proofErr w:type="gramStart"/>
-            <w:r>
-              <w:rPr>
-                <w:rFonts w:ascii="仿宋" w:eastAsia="仿宋" w:hAnsi="仿宋" w:cs="仿宋" w:hint="eastAsia"/>
-                <w:b/>
-                <w:bCs/>
-                <w:color w:val="000000"/>
-                <w:kern w:val="0"/>
-                <w:sz w:val="18"/>
-                <w:szCs w:val="18"/>
-                <w:lang w:bidi="ar"/>
-              </w:rPr>
-              <w:t>规</w:t>
-            </w:r>
-            <w:proofErr w:type="gramEnd"/>
-            <w:r>
-              <w:rPr>
-                <w:rFonts w:ascii="仿宋" w:eastAsia="仿宋" w:hAnsi="仿宋" w:cs="仿宋" w:hint="eastAsia"/>
-                <w:b/>
-                <w:bCs/>
-                <w:color w:val="000000"/>
-                <w:kern w:val="0"/>
-                <w:sz w:val="18"/>
-                <w:szCs w:val="18"/>
-                <w:lang w:bidi="ar"/>
-              </w:rPr>
-              <w:t>上企业（揭榜行业）情况</w:t>
-            </w:r>
-          </w:p>
-        </w:tc>
-        <w:tc>
-          <w:tcPr>
-            <w:tcW w:w="981" w:type="dxa"/>
-            <w:shd w:val="clear" w:color="auto" w:fill="auto"/>
-            <w:vAlign w:val="center"/>
-          </w:tcPr>
-          <w:p>
-            <w:pPr>
-              <w:widowControl/>
-              <w:snapToGrid w:val="0"/>
-              <w:spacing w:line="240" w:lineRule="auto"/>
-              <w:jc w:val="center"/>
-              <w:textAlignment w:val="center"/>
-              <w:rPr>
-                <w:rFonts w:ascii="仿宋" w:eastAsia="仿宋" w:hAnsi="仿宋" w:cs="仿宋"/>
-                <w:b/>
-                <w:bCs/>
-                <w:color w:val="000000"/>
-                <w:sz w:val="18"/>
-                <w:szCs w:val="18"/>
-              </w:rPr>
-            </w:pPr>
-            <w:r>
-              <w:rPr>
-                <w:rFonts w:ascii="仿宋" w:eastAsia="仿宋" w:hAnsi="仿宋" w:cs="仿宋" w:hint="eastAsia"/>
-                <w:b/>
-                <w:bCs/>
-                <w:color w:val="000000"/>
-                <w:kern w:val="0"/>
-                <w:sz w:val="18"/>
-                <w:szCs w:val="18"/>
-                <w:lang w:bidi="ar"/>
-              </w:rPr>
-              <w:t>改造</w:t>
-            </w:r>
-            <w:proofErr w:type="gramStart"/>
-            <w:r>
-              <w:rPr>
-                <w:rFonts w:ascii="仿宋" w:eastAsia="仿宋" w:hAnsi="仿宋" w:cs="仿宋" w:hint="eastAsia"/>
-                <w:b/>
-                <w:bCs/>
-                <w:color w:val="000000"/>
-                <w:kern w:val="0"/>
-                <w:sz w:val="18"/>
-                <w:szCs w:val="18"/>
-                <w:lang w:bidi="ar"/>
-              </w:rPr>
-              <w:t>规</w:t>
-            </w:r>
-            <w:proofErr w:type="gramEnd"/>
-            <w:r>
-              <w:rPr>
-                <w:rFonts w:ascii="仿宋" w:eastAsia="仿宋" w:hAnsi="仿宋" w:cs="仿宋" w:hint="eastAsia"/>
-                <w:b/>
-                <w:bCs/>
-                <w:color w:val="000000"/>
-                <w:kern w:val="0"/>
-                <w:sz w:val="18"/>
-                <w:szCs w:val="18"/>
-                <w:lang w:bidi="ar"/>
-              </w:rPr>
-              <w:t>上企业（揭榜行业）情况</w:t>
-            </w:r>
-          </w:p>
-        </w:tc>
-        <w:tc>
-          <w:tcPr>
-            <w:tcW w:w="1494" w:type="dxa"/>
-            <w:gridSpan w:val="2"/>
-            <w:shd w:val="clear" w:color="auto" w:fill="auto"/>
-            <w:vAlign w:val="center"/>
-          </w:tcPr>
-          <w:p>
-            <w:pPr>
-              <w:widowControl/>
-              <w:snapToGrid w:val="0"/>
-              <w:spacing w:line="240" w:lineRule="auto"/>
-              <w:jc w:val="center"/>
-              <w:textAlignment w:val="center"/>
-              <w:rPr>
-                <w:rFonts w:ascii="仿宋" w:eastAsia="仿宋" w:hAnsi="仿宋" w:cs="仿宋"/>
-                <w:b/>
-                <w:bCs/>
-                <w:color w:val="000000"/>
-                <w:kern w:val="0"/>
-                <w:sz w:val="18"/>
-                <w:szCs w:val="18"/>
-                <w:lang w:bidi="ar"/>
-              </w:rPr>
-            </w:pPr>
-            <w:r>
-              <w:rPr>
-                <w:rFonts w:ascii="仿宋" w:eastAsia="仿宋" w:hAnsi="仿宋" w:cs="仿宋" w:hint="eastAsia"/>
-                <w:b/>
-                <w:bCs/>
-                <w:color w:val="000000"/>
-                <w:kern w:val="0"/>
-                <w:sz w:val="18"/>
-                <w:szCs w:val="18"/>
-                <w:lang w:bidi="ar"/>
-              </w:rPr>
-              <w:t>拟落地人工智能应用场景（揭榜行业）情况</w:t>
-            </w:r>
-          </w:p>
-        </w:tc>
-        <w:tc>
-          <w:tcPr>
-            <w:tcW w:w="1580" w:type="dxa"/>
-            <w:gridSpan w:val="2"/>
-            <w:shd w:val="clear" w:color="auto" w:fill="auto"/>
-            <w:vAlign w:val="center"/>
-          </w:tcPr>
-          <w:p>
-            <w:pPr>
-              <w:widowControl/>
-              <w:snapToGrid w:val="0"/>
-              <w:spacing w:line="240" w:lineRule="auto"/>
-              <w:jc w:val="center"/>
-              <w:textAlignment w:val="center"/>
-              <w:rPr>
-                <w:rFonts w:ascii="仿宋" w:eastAsia="仿宋" w:hAnsi="仿宋" w:cs="仿宋"/>
-                <w:b/>
-                <w:bCs/>
-                <w:color w:val="000000"/>
-                <w:kern w:val="0"/>
-                <w:sz w:val="18"/>
-                <w:szCs w:val="18"/>
-                <w:lang w:bidi="ar"/>
-              </w:rPr>
-            </w:pPr>
-            <w:r>
-              <w:rPr>
-                <w:rFonts w:ascii="仿宋" w:eastAsia="仿宋" w:hAnsi="仿宋" w:cs="仿宋" w:hint="eastAsia"/>
-                <w:b/>
-                <w:bCs/>
-                <w:color w:val="000000"/>
-                <w:kern w:val="0"/>
-                <w:sz w:val="18"/>
-                <w:szCs w:val="18"/>
-                <w:lang w:bidi="ar"/>
-              </w:rPr>
-              <w:t>培育大模型（揭榜行业）情况</w:t>
-            </w:r>
-          </w:p>
-        </w:tc>
-        <w:tc>
-          <w:tcPr>
-            <w:tcW w:w="771" w:type="dxa"/>
-            <w:shd w:val="clear" w:color="auto" w:fill="auto"/>
-            <w:vAlign w:val="center"/>
-          </w:tcPr>
-          <w:p>
-            <w:pPr>
-              <w:widowControl/>
-              <w:snapToGrid w:val="0"/>
-              <w:spacing w:line="240" w:lineRule="auto"/>
-              <w:jc w:val="center"/>
-              <w:textAlignment w:val="center"/>
-              <w:rPr>
-                <w:rFonts w:ascii="仿宋" w:eastAsia="仿宋" w:hAnsi="仿宋" w:cs="仿宋"/>
-                <w:b/>
-                <w:bCs/>
-                <w:color w:val="000000"/>
-                <w:kern w:val="0"/>
-                <w:sz w:val="18"/>
-                <w:szCs w:val="18"/>
-                <w:lang w:bidi="ar"/>
-              </w:rPr>
-            </w:pPr>
-            <w:r>
-              <w:rPr>
-                <w:rFonts w:ascii="仿宋" w:eastAsia="仿宋" w:hAnsi="仿宋" w:cs="仿宋" w:hint="eastAsia"/>
-                <w:b/>
-                <w:bCs/>
-                <w:color w:val="000000"/>
-                <w:kern w:val="0"/>
-                <w:sz w:val="18"/>
-                <w:szCs w:val="18"/>
-                <w:lang w:bidi="ar"/>
-              </w:rPr>
-              <w:t>培育智能体（揭榜行业）情况</w:t>
-            </w:r>
-          </w:p>
-        </w:tc>
-        <w:tc>
-          <w:tcPr>
-            <w:tcW w:w="776" w:type="dxa"/>
-            <w:shd w:val="clear" w:color="auto" w:fill="auto"/>
-            <w:vAlign w:val="center"/>
-          </w:tcPr>
-          <w:p>
-            <w:pPr>
-              <w:widowControl/>
-              <w:snapToGrid w:val="0"/>
-              <w:spacing w:line="240" w:lineRule="auto"/>
-              <w:jc w:val="center"/>
-              <w:textAlignment w:val="center"/>
-              <w:rPr>
-                <w:rFonts w:ascii="仿宋" w:eastAsia="仿宋" w:hAnsi="仿宋" w:cs="仿宋"/>
-                <w:b/>
-                <w:bCs/>
-                <w:color w:val="000000"/>
-                <w:kern w:val="0"/>
-                <w:sz w:val="18"/>
-                <w:szCs w:val="18"/>
-                <w:lang w:bidi="ar"/>
-              </w:rPr>
-            </w:pPr>
-            <w:r>
-              <w:rPr>
-                <w:rFonts w:ascii="仿宋" w:eastAsia="仿宋" w:hAnsi="仿宋" w:cs="仿宋" w:hint="eastAsia"/>
-                <w:b/>
-                <w:bCs/>
-                <w:color w:val="000000"/>
-                <w:kern w:val="0"/>
-                <w:sz w:val="18"/>
-                <w:szCs w:val="18"/>
-                <w:lang w:bidi="ar"/>
-              </w:rPr>
-              <w:t>培育新型智能终端（揭榜行业）情况</w:t>
-            </w:r>
-          </w:p>
-        </w:tc>
-        <w:tc>
-          <w:tcPr>
-            <w:tcW w:w="2304" w:type="dxa"/>
-            <w:gridSpan w:val="3"/>
-            <w:shd w:val="clear" w:color="auto" w:fill="auto"/>
-            <w:vAlign w:val="center"/>
-          </w:tcPr>
-          <w:p>
-            <w:pPr>
-              <w:widowControl/>
-              <w:snapToGrid w:val="0"/>
-              <w:spacing w:line="240" w:lineRule="auto"/>
-              <w:jc w:val="center"/>
-              <w:textAlignment w:val="center"/>
-              <w:rPr>
-                <w:rFonts w:ascii="仿宋" w:eastAsia="仿宋" w:hAnsi="仿宋" w:cs="仿宋"/>
-                <w:b/>
-                <w:bCs/>
-                <w:color w:val="000000"/>
-                <w:kern w:val="0"/>
-                <w:sz w:val="18"/>
-                <w:szCs w:val="18"/>
-                <w:lang w:bidi="ar"/>
-              </w:rPr>
-            </w:pPr>
-            <w:r>
-              <w:rPr>
-                <w:rFonts w:ascii="仿宋" w:eastAsia="仿宋" w:hAnsi="仿宋" w:cs="仿宋" w:hint="eastAsia"/>
-                <w:b/>
-                <w:bCs/>
-                <w:color w:val="000000"/>
-                <w:kern w:val="0"/>
-                <w:sz w:val="18"/>
-                <w:szCs w:val="18"/>
-                <w:lang w:bidi="ar"/>
-              </w:rPr>
-              <w:t>建成数据集或语料库（揭榜行业）情况</w:t>
-            </w:r>
-          </w:p>
-        </w:tc>
-        <w:tc>
-          <w:tcPr>
-            <w:tcW w:w="1027" w:type="dxa"/>
-            <w:shd w:val="clear" w:color="auto" w:fill="auto"/>
-            <w:vAlign w:val="center"/>
-          </w:tcPr>
-          <w:p>
-            <w:pPr>
-              <w:widowControl/>
-              <w:snapToGrid w:val="0"/>
-              <w:spacing w:line="240" w:lineRule="auto"/>
-              <w:jc w:val="center"/>
-              <w:textAlignment w:val="center"/>
-              <w:rPr>
-                <w:rFonts w:ascii="仿宋" w:eastAsia="仿宋" w:hAnsi="仿宋" w:cs="仿宋"/>
-                <w:b/>
-                <w:bCs/>
-                <w:color w:val="000000"/>
-                <w:sz w:val="18"/>
-                <w:szCs w:val="18"/>
-              </w:rPr>
-            </w:pPr>
-            <w:r>
-              <w:rPr>
-                <w:rFonts w:ascii="仿宋" w:eastAsia="仿宋" w:hAnsi="仿宋" w:cs="仿宋" w:hint="eastAsia"/>
-                <w:b/>
-                <w:bCs/>
-                <w:color w:val="000000"/>
-                <w:sz w:val="18"/>
-                <w:szCs w:val="18"/>
-              </w:rPr>
-              <w:t>培育“人工智能+制造”服务商</w:t>
-            </w:r>
-          </w:p>
-        </w:tc>
-        <w:tc>
-          <w:tcPr>
-            <w:tcW w:w="1016" w:type="dxa"/>
-            <w:shd w:val="clear" w:color="auto" w:fill="auto"/>
-            <w:vAlign w:val="center"/>
-          </w:tcPr>
-          <w:p>
-            <w:pPr>
-              <w:widowControl/>
-              <w:snapToGrid w:val="0"/>
-              <w:spacing w:line="240" w:lineRule="auto"/>
-              <w:jc w:val="center"/>
-              <w:textAlignment w:val="center"/>
-              <w:rPr>
-                <w:rFonts w:ascii="仿宋" w:eastAsia="仿宋" w:hAnsi="仿宋" w:cs="仿宋"/>
-                <w:b/>
-                <w:bCs/>
-                <w:color w:val="000000"/>
-                <w:sz w:val="18"/>
-                <w:szCs w:val="18"/>
-              </w:rPr>
-            </w:pPr>
-            <w:r>
-              <w:rPr>
-                <w:rFonts w:ascii="仿宋" w:eastAsia="仿宋" w:hAnsi="仿宋" w:cs="仿宋" w:hint="eastAsia"/>
-                <w:b/>
-                <w:bCs/>
-                <w:color w:val="000000"/>
-                <w:kern w:val="0"/>
-                <w:sz w:val="18"/>
-                <w:szCs w:val="18"/>
-                <w:lang w:bidi="ar"/>
-              </w:rPr>
-              <w:t>通过DCMM贯标（揭榜行业）企业情况</w:t>
-            </w:r>
-          </w:p>
-        </w:tc>
-        <w:tc>
-          <w:tcPr>
-            <w:tcW w:w="903" w:type="dxa"/>
-            <w:shd w:val="clear" w:color="auto" w:fill="auto"/>
-            <w:vAlign w:val="center"/>
-          </w:tcPr>
-          <w:p>
-            <w:pPr>
-              <w:widowControl/>
-              <w:snapToGrid w:val="0"/>
-              <w:spacing w:line="240" w:lineRule="auto"/>
-              <w:jc w:val="center"/>
-              <w:textAlignment w:val="center"/>
-              <w:rPr>
-                <w:rFonts w:ascii="仿宋" w:eastAsia="仿宋" w:hAnsi="仿宋" w:cs="仿宋"/>
-                <w:b/>
-                <w:bCs/>
-                <w:color w:val="000000"/>
-                <w:sz w:val="18"/>
-                <w:szCs w:val="18"/>
-              </w:rPr>
-            </w:pPr>
-            <w:r>
-              <w:rPr>
-                <w:rFonts w:ascii="仿宋" w:eastAsia="仿宋" w:hAnsi="仿宋" w:cs="仿宋" w:hint="eastAsia"/>
-                <w:b/>
-                <w:bCs/>
-                <w:color w:val="000000"/>
-                <w:kern w:val="0"/>
-                <w:sz w:val="18"/>
-                <w:szCs w:val="18"/>
-                <w:lang w:bidi="ar"/>
-              </w:rPr>
-              <w:t>“人工智能+制造”专题培训情况</w:t>
-            </w:r>
-          </w:p>
-        </w:tc>
-        <w:tc>
-          <w:tcPr>
-            <w:tcW w:w="780" w:type="dxa"/>
-            <w:shd w:val="clear" w:color="auto" w:fill="auto"/>
-            <w:vAlign w:val="center"/>
-          </w:tcPr>
-          <w:p>
-            <w:pPr>
-              <w:widowControl/>
-              <w:snapToGrid w:val="0"/>
-              <w:spacing w:line="240" w:lineRule="auto"/>
-              <w:jc w:val="center"/>
-              <w:textAlignment w:val="center"/>
-              <w:rPr>
-                <w:rFonts w:ascii="仿宋" w:eastAsia="仿宋" w:hAnsi="仿宋" w:cs="仿宋"/>
-                <w:b/>
-                <w:bCs/>
-                <w:color w:val="000000"/>
-                <w:kern w:val="0"/>
-                <w:sz w:val="18"/>
-                <w:szCs w:val="18"/>
-                <w:lang w:bidi="ar"/>
-              </w:rPr>
-            </w:pPr>
-            <w:r>
-              <w:rPr>
-                <w:rFonts w:ascii="仿宋" w:eastAsia="仿宋" w:hAnsi="仿宋" w:cs="仿宋" w:hint="eastAsia"/>
-                <w:b/>
-                <w:bCs/>
-                <w:color w:val="000000"/>
-                <w:kern w:val="0"/>
-                <w:sz w:val="18"/>
-                <w:szCs w:val="18"/>
-                <w:lang w:bidi="ar"/>
-              </w:rPr>
-              <w:t>媒体发布宣传报道情况</w:t>
-            </w:r>
-          </w:p>
-        </w:tc>
-        <w:tc>
-          <w:tcPr>
-            <w:tcW w:w="504" w:type="dxa"/>
-            <w:vMerge w:val="restart"/>
-            <w:shd w:val="clear" w:color="auto" w:fill="auto"/>
-            <w:vAlign w:val="center"/>
-          </w:tcPr>
-          <w:p>
-            <w:pPr>
-              <w:widowControl/>
-              <w:snapToGrid w:val="0"/>
-              <w:spacing w:line="240" w:lineRule="auto"/>
-              <w:jc w:val="center"/>
-              <w:textAlignment w:val="center"/>
-              <w:rPr>
-                <w:rFonts w:ascii="仿宋" w:eastAsia="仿宋" w:hAnsi="仿宋" w:cs="仿宋"/>
-                <w:b/>
-                <w:bCs/>
-                <w:color w:val="000000"/>
-                <w:sz w:val="18"/>
-                <w:szCs w:val="18"/>
-              </w:rPr>
-            </w:pPr>
-            <w:r>
-              <w:rPr>
-                <w:rFonts w:ascii="仿宋" w:eastAsia="仿宋" w:hAnsi="仿宋" w:cs="仿宋" w:hint="eastAsia"/>
-                <w:b/>
-                <w:bCs/>
-                <w:color w:val="000000"/>
-                <w:kern w:val="0"/>
-                <w:sz w:val="18"/>
-                <w:szCs w:val="18"/>
-                <w:lang w:bidi="ar"/>
-              </w:rPr>
-              <w:t>备注</w:t>
-            </w:r>
-          </w:p>
-        </w:tc>
-      </w:tr>
-      <w:tr>
-        <w:trPr>
-          <w:tblHeader/>
-          <w:jc w:val="center"/>
-        </w:trPr>
-        <w:tc>
-          <w:tcPr>
-            <w:tcW w:w="538" w:type="dxa"/>
-            <w:vMerge/>
-            <w:shd w:val="clear" w:color="auto" w:fill="auto"/>
-            <w:noWrap/>
-            <w:vAlign w:val="center"/>
-          </w:tcPr>
-          <w:p>
-            <w:pPr>
-              <w:snapToGrid w:val="0"/>
-              <w:spacing w:line="240" w:lineRule="auto"/>
-              <w:jc w:val="center"/>
-              <w:rPr>
-                <w:rFonts w:ascii="仿宋" w:eastAsia="仿宋" w:hAnsi="仿宋" w:cs="仿宋"/>
-                <w:b/>
-                <w:bCs/>
-                <w:color w:val="000000"/>
-                <w:sz w:val="18"/>
-                <w:szCs w:val="18"/>
-              </w:rPr>
-            </w:pPr>
-          </w:p>
-        </w:tc>
-        <w:tc>
-          <w:tcPr>
-            <w:tcW w:w="538" w:type="dxa"/>
-            <w:vMerge/>
-            <w:shd w:val="clear" w:color="auto" w:fill="auto"/>
-            <w:noWrap/>
-            <w:vAlign w:val="center"/>
-          </w:tcPr>
-          <w:p>
-            <w:pPr>
-              <w:snapToGrid w:val="0"/>
-              <w:spacing w:line="240" w:lineRule="auto"/>
-              <w:jc w:val="center"/>
-              <w:rPr>
-                <w:rFonts w:ascii="仿宋" w:eastAsia="仿宋" w:hAnsi="仿宋" w:cs="仿宋"/>
-                <w:b/>
-                <w:bCs/>
-                <w:color w:val="000000"/>
-                <w:sz w:val="18"/>
-                <w:szCs w:val="18"/>
-              </w:rPr>
-            </w:pPr>
-          </w:p>
-        </w:tc>
-        <w:tc>
-          <w:tcPr>
-            <w:tcW w:w="961" w:type="dxa"/>
-            <w:shd w:val="clear" w:color="auto" w:fill="auto"/>
-            <w:vAlign w:val="center"/>
-          </w:tcPr>
-          <w:p>
-            <w:pPr>
-              <w:widowControl/>
-              <w:snapToGrid w:val="0"/>
-              <w:spacing w:line="240" w:lineRule="auto"/>
-              <w:jc w:val="center"/>
-              <w:textAlignment w:val="center"/>
-              <w:rPr>
-                <w:rFonts w:ascii="仿宋" w:eastAsia="仿宋" w:hAnsi="仿宋" w:cs="仿宋"/>
-                <w:b/>
-                <w:bCs/>
-                <w:color w:val="000000"/>
-                <w:sz w:val="18"/>
-                <w:szCs w:val="18"/>
-              </w:rPr>
-            </w:pPr>
-            <w:proofErr w:type="gramStart"/>
-            <w:r>
-              <w:rPr>
-                <w:rFonts w:ascii="仿宋" w:eastAsia="仿宋" w:hAnsi="仿宋" w:cs="仿宋" w:hint="eastAsia"/>
-                <w:b/>
-                <w:bCs/>
-                <w:color w:val="000000"/>
-                <w:kern w:val="0"/>
-                <w:sz w:val="18"/>
-                <w:szCs w:val="18"/>
-                <w:lang w:bidi="ar"/>
-              </w:rPr>
-              <w:t>规</w:t>
-            </w:r>
-            <w:proofErr w:type="gramEnd"/>
-            <w:r>
-              <w:rPr>
-                <w:rFonts w:ascii="仿宋" w:eastAsia="仿宋" w:hAnsi="仿宋" w:cs="仿宋" w:hint="eastAsia"/>
-                <w:b/>
-                <w:bCs/>
-                <w:color w:val="000000"/>
-                <w:kern w:val="0"/>
-                <w:sz w:val="18"/>
-                <w:szCs w:val="18"/>
-                <w:lang w:bidi="ar"/>
-              </w:rPr>
-              <w:t>上企业总数（家）/其中营收过亿元企业数量（家）</w:t>
-            </w:r>
-          </w:p>
-        </w:tc>
-        <w:tc>
-          <w:tcPr>
-            <w:tcW w:w="981" w:type="dxa"/>
-            <w:shd w:val="clear" w:color="auto" w:fill="auto"/>
-            <w:vAlign w:val="center"/>
-          </w:tcPr>
-          <w:p>
-            <w:pPr>
-              <w:widowControl/>
-              <w:snapToGrid w:val="0"/>
-              <w:spacing w:line="240" w:lineRule="auto"/>
-              <w:jc w:val="center"/>
-              <w:textAlignment w:val="center"/>
-              <w:rPr>
-                <w:rFonts w:ascii="仿宋" w:eastAsia="仿宋" w:hAnsi="仿宋" w:cs="仿宋"/>
-                <w:b/>
-                <w:bCs/>
-                <w:color w:val="000000"/>
-                <w:sz w:val="18"/>
-                <w:szCs w:val="18"/>
-              </w:rPr>
-            </w:pPr>
-            <w:r>
-              <w:rPr>
-                <w:rFonts w:ascii="仿宋" w:eastAsia="仿宋" w:hAnsi="仿宋" w:cs="仿宋" w:hint="eastAsia"/>
-                <w:b/>
-                <w:bCs/>
-                <w:color w:val="000000"/>
-                <w:kern w:val="0"/>
-                <w:sz w:val="18"/>
-                <w:szCs w:val="18"/>
-                <w:lang w:bidi="ar"/>
-              </w:rPr>
-              <w:t>累计改造企业数量（家）/其中累计营收过亿元企业数量（家）</w:t>
-            </w:r>
-          </w:p>
-        </w:tc>
-        <w:tc>
-          <w:tcPr>
-            <w:tcW w:w="747" w:type="dxa"/>
-            <w:shd w:val="clear" w:color="auto" w:fill="auto"/>
-            <w:vAlign w:val="center"/>
-          </w:tcPr>
-          <w:p>
-            <w:pPr>
-              <w:widowControl/>
-              <w:snapToGrid w:val="0"/>
-              <w:spacing w:line="240" w:lineRule="auto"/>
-              <w:jc w:val="center"/>
-              <w:textAlignment w:val="center"/>
-              <w:rPr>
-                <w:rFonts w:ascii="仿宋" w:eastAsia="仿宋" w:hAnsi="仿宋" w:cs="仿宋"/>
-                <w:b/>
-                <w:bCs/>
-                <w:color w:val="000000"/>
-                <w:kern w:val="0"/>
-                <w:sz w:val="18"/>
-                <w:szCs w:val="18"/>
-                <w:lang w:bidi="ar"/>
-              </w:rPr>
-            </w:pPr>
-            <w:r>
-              <w:rPr>
-                <w:rFonts w:ascii="仿宋" w:eastAsia="仿宋" w:hAnsi="仿宋" w:cs="仿宋" w:hint="eastAsia"/>
-                <w:b/>
-                <w:bCs/>
-                <w:color w:val="000000"/>
-                <w:kern w:val="0"/>
-                <w:sz w:val="18"/>
-                <w:szCs w:val="18"/>
-                <w:lang w:bidi="ar"/>
-              </w:rPr>
-              <w:t>累计行业通用场景数量（</w:t>
-            </w:r>
-            <w:proofErr w:type="gramStart"/>
-            <w:r>
-              <w:rPr>
-                <w:rFonts w:ascii="仿宋" w:eastAsia="仿宋" w:hAnsi="仿宋" w:cs="仿宋" w:hint="eastAsia"/>
-                <w:b/>
-                <w:bCs/>
-                <w:color w:val="000000"/>
-                <w:kern w:val="0"/>
-                <w:sz w:val="18"/>
-                <w:szCs w:val="18"/>
-                <w:lang w:bidi="ar"/>
-              </w:rPr>
-              <w:t>个</w:t>
-            </w:r>
-            <w:proofErr w:type="gramEnd"/>
-            <w:r>
-              <w:rPr>
-                <w:rFonts w:ascii="仿宋" w:eastAsia="仿宋" w:hAnsi="仿宋" w:cs="仿宋" w:hint="eastAsia"/>
-                <w:b/>
-                <w:bCs/>
-                <w:color w:val="000000"/>
-                <w:kern w:val="0"/>
-                <w:sz w:val="18"/>
-                <w:szCs w:val="18"/>
-                <w:lang w:bidi="ar"/>
-              </w:rPr>
-              <w:t>）</w:t>
-            </w:r>
-          </w:p>
-        </w:tc>
-        <w:tc>
-          <w:tcPr>
-            <w:tcW w:w="747" w:type="dxa"/>
-            <w:shd w:val="clear" w:color="auto" w:fill="auto"/>
-            <w:vAlign w:val="center"/>
-          </w:tcPr>
-          <w:p>
-            <w:pPr>
-              <w:widowControl/>
-              <w:snapToGrid w:val="0"/>
-              <w:spacing w:line="240" w:lineRule="auto"/>
-              <w:jc w:val="center"/>
-              <w:textAlignment w:val="center"/>
-              <w:rPr>
-                <w:rFonts w:ascii="仿宋" w:eastAsia="仿宋" w:hAnsi="仿宋" w:cs="仿宋"/>
-                <w:b/>
-                <w:bCs/>
-                <w:color w:val="000000"/>
-                <w:kern w:val="0"/>
-                <w:sz w:val="18"/>
-                <w:szCs w:val="18"/>
-                <w:lang w:bidi="ar"/>
-              </w:rPr>
-            </w:pPr>
-            <w:r>
-              <w:rPr>
-                <w:rFonts w:ascii="仿宋" w:eastAsia="仿宋" w:hAnsi="仿宋" w:cs="仿宋" w:hint="eastAsia"/>
-                <w:b/>
-                <w:bCs/>
-                <w:color w:val="000000"/>
-                <w:kern w:val="0"/>
-                <w:sz w:val="18"/>
-                <w:szCs w:val="18"/>
-                <w:lang w:bidi="ar"/>
-              </w:rPr>
-              <w:t>累计行业专用场景数量（</w:t>
-            </w:r>
-            <w:proofErr w:type="gramStart"/>
-            <w:r>
-              <w:rPr>
-                <w:rFonts w:ascii="仿宋" w:eastAsia="仿宋" w:hAnsi="仿宋" w:cs="仿宋" w:hint="eastAsia"/>
-                <w:b/>
-                <w:bCs/>
-                <w:color w:val="000000"/>
-                <w:kern w:val="0"/>
-                <w:sz w:val="18"/>
-                <w:szCs w:val="18"/>
-                <w:lang w:bidi="ar"/>
-              </w:rPr>
-              <w:t>个</w:t>
-            </w:r>
-            <w:proofErr w:type="gramEnd"/>
-            <w:r>
-              <w:rPr>
-                <w:rFonts w:ascii="仿宋" w:eastAsia="仿宋" w:hAnsi="仿宋" w:cs="仿宋" w:hint="eastAsia"/>
-                <w:b/>
-                <w:bCs/>
-                <w:color w:val="000000"/>
-                <w:kern w:val="0"/>
-                <w:sz w:val="18"/>
-                <w:szCs w:val="18"/>
-                <w:lang w:bidi="ar"/>
-              </w:rPr>
-              <w:t>）</w:t>
-            </w:r>
-          </w:p>
-        </w:tc>
-        <w:tc>
-          <w:tcPr>
-            <w:tcW w:w="790" w:type="dxa"/>
-            <w:shd w:val="clear" w:color="auto" w:fill="auto"/>
-            <w:vAlign w:val="center"/>
-          </w:tcPr>
-          <w:p>
-            <w:pPr>
-              <w:snapToGrid w:val="0"/>
-              <w:spacing w:line="240" w:lineRule="auto"/>
-              <w:jc w:val="center"/>
-              <w:rPr>
-                <w:rFonts w:ascii="仿宋" w:eastAsia="仿宋" w:hAnsi="仿宋" w:cs="仿宋"/>
-                <w:b/>
-                <w:bCs/>
-                <w:color w:val="000000"/>
-                <w:sz w:val="18"/>
-                <w:szCs w:val="18"/>
-              </w:rPr>
-            </w:pPr>
-            <w:r>
-              <w:rPr>
-                <w:rFonts w:ascii="仿宋" w:eastAsia="仿宋" w:hAnsi="仿宋" w:cs="仿宋" w:hint="eastAsia"/>
-                <w:b/>
-                <w:bCs/>
-                <w:color w:val="000000"/>
-                <w:sz w:val="18"/>
-                <w:szCs w:val="18"/>
-              </w:rPr>
-              <w:t>累计</w:t>
-            </w:r>
-            <w:r>
-              <w:rPr>
-                <w:rFonts w:ascii="仿宋" w:eastAsia="仿宋" w:hAnsi="仿宋" w:cs="仿宋" w:hint="eastAsia"/>
-                <w:b/>
-                <w:bCs/>
-                <w:color w:val="000000"/>
-                <w:kern w:val="0"/>
-                <w:sz w:val="18"/>
-                <w:szCs w:val="18"/>
-                <w:lang w:bidi="ar"/>
-              </w:rPr>
-              <w:t>通过第三方认证的</w:t>
-            </w:r>
-            <w:r>
-              <w:rPr>
-                <w:rFonts w:ascii="仿宋" w:eastAsia="仿宋" w:hAnsi="仿宋" w:cs="仿宋" w:hint="eastAsia"/>
-                <w:b/>
-                <w:bCs/>
-                <w:color w:val="000000"/>
-                <w:sz w:val="18"/>
-                <w:szCs w:val="18"/>
-              </w:rPr>
-              <w:t>行业通用大模型数量（</w:t>
-            </w:r>
-            <w:proofErr w:type="gramStart"/>
-            <w:r>
-              <w:rPr>
-                <w:rFonts w:ascii="仿宋" w:eastAsia="仿宋" w:hAnsi="仿宋" w:cs="仿宋" w:hint="eastAsia"/>
-                <w:b/>
-                <w:bCs/>
-                <w:color w:val="000000"/>
-                <w:sz w:val="18"/>
-                <w:szCs w:val="18"/>
-              </w:rPr>
-              <w:t>个</w:t>
-            </w:r>
-            <w:proofErr w:type="gramEnd"/>
-            <w:r>
-              <w:rPr>
-                <w:rFonts w:ascii="仿宋" w:eastAsia="仿宋" w:hAnsi="仿宋" w:cs="仿宋" w:hint="eastAsia"/>
-                <w:b/>
-                <w:bCs/>
-                <w:color w:val="000000"/>
-                <w:sz w:val="18"/>
-                <w:szCs w:val="18"/>
-              </w:rPr>
-              <w:t>）</w:t>
-            </w:r>
-          </w:p>
-        </w:tc>
-        <w:tc>
-          <w:tcPr>
-            <w:tcW w:w="790" w:type="dxa"/>
-            <w:shd w:val="clear" w:color="auto" w:fill="auto"/>
-            <w:vAlign w:val="center"/>
-          </w:tcPr>
-          <w:p>
-            <w:pPr>
-              <w:snapToGrid w:val="0"/>
-              <w:spacing w:line="240" w:lineRule="auto"/>
-              <w:jc w:val="center"/>
-              <w:rPr>
-                <w:rFonts w:ascii="仿宋" w:eastAsia="仿宋" w:hAnsi="仿宋" w:cs="仿宋"/>
-                <w:b/>
-                <w:bCs/>
-                <w:color w:val="000000"/>
-                <w:sz w:val="18"/>
-                <w:szCs w:val="18"/>
-              </w:rPr>
-            </w:pPr>
-            <w:r>
-              <w:rPr>
-                <w:rFonts w:ascii="仿宋" w:eastAsia="仿宋" w:hAnsi="仿宋" w:cs="仿宋" w:hint="eastAsia"/>
-                <w:b/>
-                <w:bCs/>
-                <w:color w:val="000000"/>
-                <w:sz w:val="18"/>
-                <w:szCs w:val="18"/>
-              </w:rPr>
-              <w:t>累计</w:t>
-            </w:r>
-            <w:r>
-              <w:rPr>
-                <w:rFonts w:ascii="仿宋" w:eastAsia="仿宋" w:hAnsi="仿宋" w:cs="仿宋" w:hint="eastAsia"/>
-                <w:b/>
-                <w:bCs/>
-                <w:color w:val="000000"/>
-                <w:kern w:val="0"/>
-                <w:sz w:val="18"/>
-                <w:szCs w:val="18"/>
-                <w:lang w:bidi="ar"/>
-              </w:rPr>
-              <w:t>通过第三方认证的</w:t>
-            </w:r>
-            <w:r>
-              <w:rPr>
-                <w:rFonts w:ascii="仿宋" w:eastAsia="仿宋" w:hAnsi="仿宋" w:cs="仿宋" w:hint="eastAsia"/>
-                <w:b/>
-                <w:bCs/>
-                <w:color w:val="000000"/>
-                <w:sz w:val="18"/>
-                <w:szCs w:val="18"/>
-              </w:rPr>
-              <w:t>行业专用大模型数量（</w:t>
-            </w:r>
-            <w:proofErr w:type="gramStart"/>
-            <w:r>
-              <w:rPr>
-                <w:rFonts w:ascii="仿宋" w:eastAsia="仿宋" w:hAnsi="仿宋" w:cs="仿宋" w:hint="eastAsia"/>
-                <w:b/>
-                <w:bCs/>
-                <w:color w:val="000000"/>
-                <w:sz w:val="18"/>
-                <w:szCs w:val="18"/>
-              </w:rPr>
-              <w:t>个</w:t>
-            </w:r>
-            <w:proofErr w:type="gramEnd"/>
-            <w:r>
-              <w:rPr>
-                <w:rFonts w:ascii="仿宋" w:eastAsia="仿宋" w:hAnsi="仿宋" w:cs="仿宋" w:hint="eastAsia"/>
-                <w:b/>
-                <w:bCs/>
-                <w:color w:val="000000"/>
-                <w:sz w:val="18"/>
-                <w:szCs w:val="18"/>
-              </w:rPr>
-              <w:t>）</w:t>
-            </w:r>
-          </w:p>
-        </w:tc>
-        <w:tc>
-          <w:tcPr>
-            <w:tcW w:w="771" w:type="dxa"/>
-            <w:shd w:val="clear" w:color="auto" w:fill="auto"/>
-            <w:vAlign w:val="center"/>
-          </w:tcPr>
-          <w:p>
-            <w:pPr>
-              <w:snapToGrid w:val="0"/>
-              <w:spacing w:line="240" w:lineRule="auto"/>
-              <w:jc w:val="center"/>
-              <w:rPr>
-                <w:rFonts w:ascii="仿宋" w:eastAsia="仿宋" w:hAnsi="仿宋" w:cs="仿宋"/>
-                <w:b/>
-                <w:bCs/>
-                <w:color w:val="000000"/>
-                <w:sz w:val="18"/>
-                <w:szCs w:val="18"/>
-              </w:rPr>
-            </w:pPr>
-            <w:r>
-              <w:rPr>
-                <w:rFonts w:ascii="仿宋" w:eastAsia="仿宋" w:hAnsi="仿宋" w:cs="仿宋" w:hint="eastAsia"/>
-                <w:b/>
-                <w:bCs/>
-                <w:color w:val="000000"/>
-                <w:kern w:val="0"/>
-                <w:sz w:val="18"/>
-                <w:szCs w:val="18"/>
-                <w:lang w:bidi="ar"/>
-              </w:rPr>
-              <w:t>累计通过第三方认证的智能体数量</w:t>
-            </w:r>
-            <w:r>
-              <w:rPr>
-                <w:rFonts w:ascii="仿宋" w:eastAsia="仿宋" w:hAnsi="仿宋" w:cs="仿宋" w:hint="eastAsia"/>
-                <w:b/>
-                <w:bCs/>
-                <w:color w:val="000000"/>
-                <w:sz w:val="18"/>
-                <w:szCs w:val="18"/>
-              </w:rPr>
-              <w:t>（</w:t>
-            </w:r>
-            <w:proofErr w:type="gramStart"/>
-            <w:r>
-              <w:rPr>
-                <w:rFonts w:ascii="仿宋" w:eastAsia="仿宋" w:hAnsi="仿宋" w:cs="仿宋" w:hint="eastAsia"/>
-                <w:b/>
-                <w:bCs/>
-                <w:color w:val="000000"/>
-                <w:sz w:val="18"/>
-                <w:szCs w:val="18"/>
-              </w:rPr>
-              <w:t>个</w:t>
-            </w:r>
-            <w:proofErr w:type="gramEnd"/>
-            <w:r>
-              <w:rPr>
-                <w:rFonts w:ascii="仿宋" w:eastAsia="仿宋" w:hAnsi="仿宋" w:cs="仿宋" w:hint="eastAsia"/>
-                <w:b/>
-                <w:bCs/>
-                <w:color w:val="000000"/>
-                <w:sz w:val="18"/>
-                <w:szCs w:val="18"/>
-              </w:rPr>
-              <w:t>）</w:t>
-            </w:r>
-          </w:p>
-        </w:tc>
-        <w:tc>
-          <w:tcPr>
-            <w:tcW w:w="776" w:type="dxa"/>
-            <w:shd w:val="clear" w:color="auto" w:fill="auto"/>
-            <w:vAlign w:val="center"/>
-          </w:tcPr>
-          <w:p>
-            <w:pPr>
-              <w:snapToGrid w:val="0"/>
-              <w:spacing w:line="240" w:lineRule="auto"/>
-              <w:jc w:val="center"/>
-              <w:rPr>
-                <w:rFonts w:ascii="仿宋" w:eastAsia="仿宋" w:hAnsi="仿宋" w:cs="仿宋"/>
-                <w:b/>
-                <w:bCs/>
-                <w:color w:val="000000"/>
-                <w:kern w:val="0"/>
-                <w:sz w:val="18"/>
-                <w:szCs w:val="18"/>
-                <w:lang w:bidi="ar"/>
-              </w:rPr>
-            </w:pPr>
-            <w:r>
-              <w:rPr>
-                <w:rFonts w:ascii="仿宋" w:eastAsia="仿宋" w:hAnsi="仿宋" w:cs="仿宋" w:hint="eastAsia"/>
-                <w:b/>
-                <w:bCs/>
-                <w:color w:val="000000"/>
-                <w:kern w:val="0"/>
-                <w:sz w:val="18"/>
-                <w:szCs w:val="18"/>
-                <w:lang w:bidi="ar"/>
-              </w:rPr>
-              <w:t>累计通过第三方认证的智能终端数量</w:t>
-            </w:r>
-            <w:r>
-              <w:rPr>
-                <w:rFonts w:ascii="仿宋" w:eastAsia="仿宋" w:hAnsi="仿宋" w:cs="仿宋" w:hint="eastAsia"/>
-                <w:b/>
-                <w:bCs/>
-                <w:color w:val="000000"/>
-                <w:sz w:val="18"/>
-                <w:szCs w:val="18"/>
-              </w:rPr>
-              <w:t>（</w:t>
-            </w:r>
-            <w:proofErr w:type="gramStart"/>
-            <w:r>
-              <w:rPr>
-                <w:rFonts w:ascii="仿宋" w:eastAsia="仿宋" w:hAnsi="仿宋" w:cs="仿宋" w:hint="eastAsia"/>
-                <w:b/>
-                <w:bCs/>
-                <w:color w:val="000000"/>
-                <w:sz w:val="18"/>
-                <w:szCs w:val="18"/>
-              </w:rPr>
-              <w:t>个</w:t>
-            </w:r>
-            <w:proofErr w:type="gramEnd"/>
-            <w:r>
-              <w:rPr>
-                <w:rFonts w:ascii="仿宋" w:eastAsia="仿宋" w:hAnsi="仿宋" w:cs="仿宋" w:hint="eastAsia"/>
-                <w:b/>
-                <w:bCs/>
-                <w:color w:val="000000"/>
-                <w:sz w:val="18"/>
-                <w:szCs w:val="18"/>
-              </w:rPr>
-              <w:t>）</w:t>
-            </w:r>
-          </w:p>
-        </w:tc>
-        <w:tc>
-          <w:tcPr>
-            <w:tcW w:w="768" w:type="dxa"/>
-            <w:shd w:val="clear" w:color="auto" w:fill="auto"/>
-            <w:vAlign w:val="center"/>
-          </w:tcPr>
-          <w:p>
-            <w:pPr>
-              <w:snapToGrid w:val="0"/>
-              <w:spacing w:line="240" w:lineRule="auto"/>
-              <w:jc w:val="center"/>
-              <w:rPr>
-                <w:rFonts w:ascii="仿宋" w:eastAsia="仿宋" w:hAnsi="仿宋" w:cs="仿宋"/>
-                <w:b/>
-                <w:bCs/>
-                <w:color w:val="000000"/>
-                <w:sz w:val="18"/>
-                <w:szCs w:val="18"/>
-              </w:rPr>
-            </w:pPr>
-            <w:r>
-              <w:rPr>
-                <w:rFonts w:ascii="仿宋" w:eastAsia="仿宋" w:hAnsi="仿宋" w:cs="仿宋" w:hint="eastAsia"/>
-                <w:b/>
-                <w:bCs/>
-                <w:color w:val="000000"/>
-                <w:kern w:val="0"/>
-                <w:sz w:val="18"/>
-                <w:szCs w:val="18"/>
-                <w:lang w:bidi="ar"/>
-              </w:rPr>
-              <w:t>累计</w:t>
-            </w:r>
-            <w:r>
-              <w:rPr>
-                <w:rFonts w:ascii="仿宋" w:eastAsia="仿宋" w:hAnsi="仿宋" w:cs="仿宋" w:hint="eastAsia"/>
-                <w:b/>
-                <w:bCs/>
-                <w:color w:val="000000"/>
-                <w:sz w:val="18"/>
-                <w:szCs w:val="18"/>
-              </w:rPr>
-              <w:t>行业通用</w:t>
-            </w:r>
-            <w:r>
-              <w:rPr>
-                <w:rFonts w:ascii="仿宋" w:eastAsia="仿宋" w:hAnsi="仿宋" w:cs="仿宋" w:hint="eastAsia"/>
-                <w:b/>
-                <w:bCs/>
-                <w:color w:val="000000"/>
-                <w:kern w:val="0"/>
-                <w:sz w:val="18"/>
-                <w:szCs w:val="18"/>
-                <w:lang w:bidi="ar"/>
-              </w:rPr>
-              <w:t>数据集或语料库数量</w:t>
-            </w:r>
-            <w:r>
-              <w:rPr>
-                <w:rFonts w:ascii="仿宋" w:eastAsia="仿宋" w:hAnsi="仿宋" w:cs="仿宋" w:hint="eastAsia"/>
-                <w:b/>
-                <w:bCs/>
-                <w:color w:val="000000"/>
-                <w:sz w:val="18"/>
-                <w:szCs w:val="18"/>
-              </w:rPr>
-              <w:t>（</w:t>
-            </w:r>
-            <w:proofErr w:type="gramStart"/>
-            <w:r>
-              <w:rPr>
-                <w:rFonts w:ascii="仿宋" w:eastAsia="仿宋" w:hAnsi="仿宋" w:cs="仿宋" w:hint="eastAsia"/>
-                <w:b/>
-                <w:bCs/>
-                <w:color w:val="000000"/>
-                <w:sz w:val="18"/>
-                <w:szCs w:val="18"/>
-              </w:rPr>
-              <w:t>个</w:t>
-            </w:r>
-            <w:proofErr w:type="gramEnd"/>
-            <w:r>
-              <w:rPr>
-                <w:rFonts w:ascii="仿宋" w:eastAsia="仿宋" w:hAnsi="仿宋" w:cs="仿宋" w:hint="eastAsia"/>
-                <w:b/>
-                <w:bCs/>
-                <w:color w:val="000000"/>
-                <w:sz w:val="18"/>
-                <w:szCs w:val="18"/>
-              </w:rPr>
-              <w:t>）</w:t>
-            </w:r>
-          </w:p>
-        </w:tc>
-        <w:tc>
-          <w:tcPr>
-            <w:tcW w:w="768" w:type="dxa"/>
-            <w:shd w:val="clear" w:color="auto" w:fill="auto"/>
-            <w:vAlign w:val="center"/>
-          </w:tcPr>
-          <w:p>
-            <w:pPr>
-              <w:snapToGrid w:val="0"/>
-              <w:spacing w:line="240" w:lineRule="auto"/>
-              <w:jc w:val="center"/>
-              <w:rPr>
-                <w:rFonts w:ascii="仿宋" w:eastAsia="仿宋" w:hAnsi="仿宋" w:cs="仿宋"/>
-                <w:b/>
-                <w:bCs/>
-                <w:color w:val="000000"/>
-                <w:sz w:val="18"/>
-                <w:szCs w:val="18"/>
-              </w:rPr>
-            </w:pPr>
-            <w:r>
-              <w:rPr>
-                <w:rFonts w:ascii="仿宋" w:eastAsia="仿宋" w:hAnsi="仿宋" w:cs="仿宋" w:hint="eastAsia"/>
-                <w:b/>
-                <w:bCs/>
-                <w:color w:val="000000"/>
-                <w:kern w:val="0"/>
-                <w:sz w:val="18"/>
-                <w:szCs w:val="18"/>
-                <w:lang w:bidi="ar"/>
-              </w:rPr>
-              <w:t>累计</w:t>
-            </w:r>
-            <w:r>
-              <w:rPr>
-                <w:rFonts w:ascii="仿宋" w:eastAsia="仿宋" w:hAnsi="仿宋" w:cs="仿宋" w:hint="eastAsia"/>
-                <w:b/>
-                <w:bCs/>
-                <w:color w:val="000000"/>
-                <w:sz w:val="18"/>
-                <w:szCs w:val="18"/>
-              </w:rPr>
-              <w:t>行业专用</w:t>
-            </w:r>
-            <w:r>
-              <w:rPr>
-                <w:rFonts w:ascii="仿宋" w:eastAsia="仿宋" w:hAnsi="仿宋" w:cs="仿宋" w:hint="eastAsia"/>
-                <w:b/>
-                <w:bCs/>
-                <w:color w:val="000000"/>
-                <w:kern w:val="0"/>
-                <w:sz w:val="18"/>
-                <w:szCs w:val="18"/>
-                <w:lang w:bidi="ar"/>
-              </w:rPr>
-              <w:t>数据集或语料库数量</w:t>
-            </w:r>
-            <w:r>
-              <w:rPr>
-                <w:rFonts w:ascii="仿宋" w:eastAsia="仿宋" w:hAnsi="仿宋" w:cs="仿宋" w:hint="eastAsia"/>
-                <w:b/>
-                <w:bCs/>
-                <w:color w:val="000000"/>
-                <w:sz w:val="18"/>
-                <w:szCs w:val="18"/>
-              </w:rPr>
-              <w:t>（</w:t>
-            </w:r>
-            <w:proofErr w:type="gramStart"/>
-            <w:r>
-              <w:rPr>
-                <w:rFonts w:ascii="仿宋" w:eastAsia="仿宋" w:hAnsi="仿宋" w:cs="仿宋" w:hint="eastAsia"/>
-                <w:b/>
-                <w:bCs/>
-                <w:color w:val="000000"/>
-                <w:sz w:val="18"/>
-                <w:szCs w:val="18"/>
-              </w:rPr>
-              <w:t>个</w:t>
-            </w:r>
-            <w:proofErr w:type="gramEnd"/>
-            <w:r>
-              <w:rPr>
-                <w:rFonts w:ascii="仿宋" w:eastAsia="仿宋" w:hAnsi="仿宋" w:cs="仿宋" w:hint="eastAsia"/>
-                <w:b/>
-                <w:bCs/>
-                <w:color w:val="000000"/>
-                <w:sz w:val="18"/>
-                <w:szCs w:val="18"/>
-              </w:rPr>
-              <w:t>）</w:t>
-            </w:r>
-          </w:p>
-        </w:tc>
-        <w:tc>
-          <w:tcPr>
-            <w:tcW w:w="768" w:type="dxa"/>
-            <w:shd w:val="clear" w:color="auto" w:fill="auto"/>
-            <w:vAlign w:val="center"/>
-          </w:tcPr>
-          <w:p>
-            <w:pPr>
-              <w:snapToGrid w:val="0"/>
-              <w:spacing w:line="240" w:lineRule="auto"/>
-              <w:jc w:val="center"/>
-              <w:rPr>
-                <w:rFonts w:ascii="仿宋" w:eastAsia="仿宋" w:hAnsi="仿宋" w:cs="仿宋"/>
-                <w:b/>
-                <w:bCs/>
-                <w:color w:val="000000"/>
-                <w:sz w:val="18"/>
-                <w:szCs w:val="18"/>
-              </w:rPr>
-            </w:pPr>
-            <w:r>
-              <w:rPr>
-                <w:rFonts w:ascii="仿宋" w:eastAsia="仿宋" w:hAnsi="仿宋" w:cs="仿宋" w:hint="eastAsia"/>
-                <w:b/>
-                <w:bCs/>
-                <w:color w:val="000000"/>
-                <w:kern w:val="0"/>
-                <w:sz w:val="18"/>
-                <w:szCs w:val="18"/>
-                <w:lang w:bidi="ar"/>
-              </w:rPr>
-              <w:t>累计</w:t>
-            </w:r>
-            <w:r>
-              <w:rPr>
-                <w:rFonts w:ascii="仿宋" w:eastAsia="仿宋" w:hAnsi="仿宋" w:cs="仿宋" w:hint="eastAsia"/>
-                <w:b/>
-                <w:bCs/>
-                <w:color w:val="000000"/>
-                <w:sz w:val="18"/>
-                <w:szCs w:val="18"/>
-              </w:rPr>
-              <w:t>行业测评</w:t>
-            </w:r>
-            <w:r>
-              <w:rPr>
-                <w:rFonts w:ascii="仿宋" w:eastAsia="仿宋" w:hAnsi="仿宋" w:cs="仿宋" w:hint="eastAsia"/>
-                <w:b/>
-                <w:bCs/>
-                <w:color w:val="000000"/>
-                <w:kern w:val="0"/>
-                <w:sz w:val="18"/>
-                <w:szCs w:val="18"/>
-                <w:lang w:bidi="ar"/>
-              </w:rPr>
-              <w:t>数据集或语料库数量</w:t>
-            </w:r>
-            <w:r>
-              <w:rPr>
-                <w:rFonts w:ascii="仿宋" w:eastAsia="仿宋" w:hAnsi="仿宋" w:cs="仿宋" w:hint="eastAsia"/>
-                <w:b/>
-                <w:bCs/>
-                <w:color w:val="000000"/>
-                <w:sz w:val="18"/>
-                <w:szCs w:val="18"/>
-              </w:rPr>
-              <w:t>（</w:t>
-            </w:r>
-            <w:proofErr w:type="gramStart"/>
-            <w:r>
-              <w:rPr>
-                <w:rFonts w:ascii="仿宋" w:eastAsia="仿宋" w:hAnsi="仿宋" w:cs="仿宋" w:hint="eastAsia"/>
-                <w:b/>
-                <w:bCs/>
-                <w:color w:val="000000"/>
-                <w:sz w:val="18"/>
-                <w:szCs w:val="18"/>
-              </w:rPr>
-              <w:t>个</w:t>
-            </w:r>
-            <w:proofErr w:type="gramEnd"/>
-            <w:r>
-              <w:rPr>
-                <w:rFonts w:ascii="仿宋" w:eastAsia="仿宋" w:hAnsi="仿宋" w:cs="仿宋" w:hint="eastAsia"/>
-                <w:b/>
-                <w:bCs/>
-                <w:color w:val="000000"/>
-                <w:sz w:val="18"/>
-                <w:szCs w:val="18"/>
-              </w:rPr>
-              <w:t>）</w:t>
-            </w:r>
-          </w:p>
-        </w:tc>
-        <w:tc>
-          <w:tcPr>
-            <w:tcW w:w="1027" w:type="dxa"/>
-            <w:shd w:val="clear" w:color="auto" w:fill="auto"/>
-            <w:vAlign w:val="center"/>
-          </w:tcPr>
-          <w:p>
-            <w:pPr>
-              <w:snapToGrid w:val="0"/>
-              <w:spacing w:line="240" w:lineRule="auto"/>
-              <w:jc w:val="center"/>
-              <w:rPr>
-                <w:rFonts w:ascii="仿宋" w:eastAsia="仿宋" w:hAnsi="仿宋" w:cs="仿宋"/>
-                <w:b/>
-                <w:bCs/>
-                <w:color w:val="000000"/>
-                <w:sz w:val="18"/>
-                <w:szCs w:val="18"/>
-              </w:rPr>
-            </w:pPr>
-            <w:r>
-              <w:rPr>
-                <w:rFonts w:ascii="仿宋" w:eastAsia="仿宋" w:hAnsi="仿宋" w:cs="仿宋" w:hint="eastAsia"/>
-                <w:b/>
-                <w:bCs/>
-                <w:color w:val="000000"/>
-                <w:sz w:val="18"/>
-                <w:szCs w:val="18"/>
-              </w:rPr>
-              <w:t>累计</w:t>
-            </w:r>
-            <w:proofErr w:type="gramStart"/>
-            <w:r>
-              <w:rPr>
-                <w:rFonts w:ascii="仿宋" w:eastAsia="仿宋" w:hAnsi="仿宋" w:cs="仿宋" w:hint="eastAsia"/>
-                <w:b/>
-                <w:bCs/>
-                <w:color w:val="000000"/>
-                <w:sz w:val="18"/>
-                <w:szCs w:val="18"/>
-              </w:rPr>
-              <w:t>培育培育</w:t>
-            </w:r>
-            <w:proofErr w:type="gramEnd"/>
-            <w:r>
-              <w:rPr>
-                <w:rFonts w:ascii="仿宋" w:eastAsia="仿宋" w:hAnsi="仿宋" w:cs="仿宋" w:hint="eastAsia"/>
-                <w:b/>
-                <w:bCs/>
-                <w:color w:val="000000"/>
-                <w:sz w:val="18"/>
-                <w:szCs w:val="18"/>
-              </w:rPr>
-              <w:t>“人工智能+制造”服务商总数量（</w:t>
-            </w:r>
-            <w:proofErr w:type="gramStart"/>
-            <w:r>
-              <w:rPr>
-                <w:rFonts w:ascii="仿宋" w:eastAsia="仿宋" w:hAnsi="仿宋" w:cs="仿宋" w:hint="eastAsia"/>
-                <w:b/>
-                <w:bCs/>
-                <w:color w:val="000000"/>
-                <w:sz w:val="18"/>
-                <w:szCs w:val="18"/>
-              </w:rPr>
-              <w:t>个</w:t>
-            </w:r>
-            <w:proofErr w:type="gramEnd"/>
-            <w:r>
-              <w:rPr>
-                <w:rFonts w:ascii="仿宋" w:eastAsia="仿宋" w:hAnsi="仿宋" w:cs="仿宋" w:hint="eastAsia"/>
-                <w:b/>
-                <w:bCs/>
-                <w:color w:val="000000"/>
-                <w:sz w:val="18"/>
-                <w:szCs w:val="18"/>
-              </w:rPr>
-              <w:t>）</w:t>
-            </w:r>
-            <w:r>
-              <w:rPr>
-                <w:rFonts w:ascii="仿宋" w:eastAsia="仿宋" w:hAnsi="仿宋" w:cs="仿宋" w:hint="eastAsia"/>
-                <w:b/>
-                <w:bCs/>
-                <w:color w:val="000000"/>
-                <w:kern w:val="0"/>
-                <w:sz w:val="18"/>
-                <w:szCs w:val="18"/>
-                <w:lang w:bidi="ar"/>
-              </w:rPr>
-              <w:t>/</w:t>
-            </w:r>
-            <w:r>
-              <w:rPr>
-                <w:rFonts w:ascii="仿宋" w:eastAsia="仿宋" w:hAnsi="仿宋" w:cs="仿宋" w:hint="eastAsia"/>
-                <w:b/>
-                <w:bCs/>
-                <w:color w:val="000000"/>
-                <w:sz w:val="18"/>
-                <w:szCs w:val="18"/>
-              </w:rPr>
-              <w:t>其中平台型服务商数量（</w:t>
-            </w:r>
-            <w:proofErr w:type="gramStart"/>
-            <w:r>
-              <w:rPr>
-                <w:rFonts w:ascii="仿宋" w:eastAsia="仿宋" w:hAnsi="仿宋" w:cs="仿宋" w:hint="eastAsia"/>
-                <w:b/>
-                <w:bCs/>
-                <w:color w:val="000000"/>
-                <w:sz w:val="18"/>
-                <w:szCs w:val="18"/>
-              </w:rPr>
-              <w:t>个</w:t>
-            </w:r>
-            <w:proofErr w:type="gramEnd"/>
-            <w:r>
-              <w:rPr>
-                <w:rFonts w:ascii="仿宋" w:eastAsia="仿宋" w:hAnsi="仿宋" w:cs="仿宋" w:hint="eastAsia"/>
-                <w:b/>
-                <w:bCs/>
-                <w:color w:val="000000"/>
-                <w:sz w:val="18"/>
-                <w:szCs w:val="18"/>
-              </w:rPr>
-              <w:t>）</w:t>
-            </w:r>
-          </w:p>
-        </w:tc>
-        <w:tc>
-          <w:tcPr>
-            <w:tcW w:w="1016" w:type="dxa"/>
-            <w:shd w:val="clear" w:color="auto" w:fill="auto"/>
-            <w:vAlign w:val="center"/>
-          </w:tcPr>
-          <w:p>
-            <w:pPr>
-              <w:widowControl/>
-              <w:snapToGrid w:val="0"/>
-              <w:spacing w:line="240" w:lineRule="auto"/>
-              <w:jc w:val="center"/>
-              <w:textAlignment w:val="center"/>
-              <w:rPr>
-                <w:rFonts w:ascii="仿宋" w:eastAsia="仿宋" w:hAnsi="仿宋" w:cs="仿宋"/>
-                <w:b/>
-                <w:bCs/>
-                <w:color w:val="000000"/>
-                <w:sz w:val="18"/>
-                <w:szCs w:val="18"/>
-              </w:rPr>
-            </w:pPr>
-            <w:r>
-              <w:rPr>
-                <w:rFonts w:ascii="仿宋" w:eastAsia="仿宋" w:hAnsi="仿宋" w:cs="仿宋" w:hint="eastAsia"/>
-                <w:b/>
-                <w:bCs/>
-                <w:color w:val="000000"/>
-                <w:kern w:val="0"/>
-                <w:sz w:val="18"/>
-                <w:szCs w:val="18"/>
-                <w:lang w:bidi="ar"/>
-              </w:rPr>
-              <w:t>通过DCMM贯标3级及以上（揭榜行业）企业累计数量（家）</w:t>
-            </w:r>
-          </w:p>
-        </w:tc>
-        <w:tc>
-          <w:tcPr>
-            <w:tcW w:w="903" w:type="dxa"/>
-            <w:shd w:val="clear" w:color="auto" w:fill="auto"/>
-            <w:vAlign w:val="center"/>
-          </w:tcPr>
-          <w:p>
-            <w:pPr>
-              <w:widowControl/>
-              <w:snapToGrid w:val="0"/>
-              <w:spacing w:line="240" w:lineRule="auto"/>
-              <w:jc w:val="center"/>
-              <w:textAlignment w:val="center"/>
-              <w:rPr>
-                <w:rFonts w:ascii="仿宋" w:eastAsia="仿宋" w:hAnsi="仿宋" w:cs="仿宋"/>
-                <w:b/>
-                <w:bCs/>
-                <w:color w:val="000000"/>
-                <w:sz w:val="18"/>
-                <w:szCs w:val="18"/>
-              </w:rPr>
-            </w:pPr>
-            <w:r>
-              <w:rPr>
-                <w:rFonts w:ascii="仿宋" w:eastAsia="仿宋" w:hAnsi="仿宋" w:cs="仿宋" w:hint="eastAsia"/>
-                <w:b/>
-                <w:bCs/>
-                <w:color w:val="000000"/>
-                <w:kern w:val="0"/>
-                <w:sz w:val="18"/>
-                <w:szCs w:val="18"/>
-                <w:lang w:bidi="ar"/>
-              </w:rPr>
-              <w:t>“人工智能+制造”专题培训累计数量（场次、人数）</w:t>
-            </w:r>
-          </w:p>
-        </w:tc>
-        <w:tc>
-          <w:tcPr>
-            <w:tcW w:w="780" w:type="dxa"/>
-            <w:shd w:val="clear" w:color="auto" w:fill="auto"/>
-            <w:vAlign w:val="center"/>
-          </w:tcPr>
-          <w:p>
-            <w:pPr>
-              <w:widowControl/>
-              <w:snapToGrid w:val="0"/>
-              <w:spacing w:line="240" w:lineRule="auto"/>
-              <w:jc w:val="center"/>
-              <w:textAlignment w:val="center"/>
-              <w:rPr>
-                <w:rFonts w:ascii="仿宋" w:eastAsia="仿宋" w:hAnsi="仿宋" w:cs="仿宋"/>
-                <w:b/>
-                <w:bCs/>
-                <w:color w:val="000000"/>
-                <w:sz w:val="18"/>
-                <w:szCs w:val="18"/>
-              </w:rPr>
-            </w:pPr>
-            <w:r>
-              <w:rPr>
-                <w:rFonts w:ascii="仿宋" w:eastAsia="仿宋" w:hAnsi="仿宋" w:cs="仿宋" w:hint="eastAsia"/>
-                <w:b/>
-                <w:bCs/>
-                <w:color w:val="000000"/>
-                <w:kern w:val="0"/>
-                <w:sz w:val="18"/>
-                <w:szCs w:val="18"/>
-                <w:lang w:bidi="ar"/>
-              </w:rPr>
-              <w:t>省级及以上媒体发布宣传报道累计数量（篇）</w:t>
-            </w:r>
-          </w:p>
-        </w:tc>
-        <w:tc>
-          <w:tcPr>
-            <w:tcW w:w="504" w:type="dxa"/>
-            <w:vMerge/>
-            <w:shd w:val="clear" w:color="auto" w:fill="auto"/>
-            <w:vAlign w:val="center"/>
-          </w:tcPr>
-          <w:p>
-            <w:pPr>
-              <w:widowControl/>
-              <w:snapToGrid w:val="0"/>
-              <w:spacing w:line="240" w:lineRule="auto"/>
-              <w:jc w:val="center"/>
-              <w:textAlignment w:val="center"/>
-              <w:rPr>
-                <w:rFonts w:ascii="仿宋" w:eastAsia="仿宋" w:hAnsi="仿宋" w:cs="仿宋"/>
-                <w:b/>
-                <w:bCs/>
-                <w:color w:val="000000"/>
-                <w:sz w:val="18"/>
-                <w:szCs w:val="18"/>
-              </w:rPr>
-            </w:pPr>
-          </w:p>
-        </w:tc>
-      </w:tr>
-      <w:tr>
-        <w:trPr>
-          <w:jc w:val="center"/>
-        </w:trPr>
-        <w:tc>
-          <w:tcPr>
-            <w:tcW w:w="538" w:type="dxa"/>
-            <w:shd w:val="clear" w:color="auto" w:fill="auto"/>
-            <w:noWrap/>
-            <w:vAlign w:val="center"/>
-          </w:tcPr>
-          <w:p>
-            <w:pPr>
-              <w:snapToGrid w:val="0"/>
-              <w:spacing w:line="240" w:lineRule="auto"/>
-              <w:jc w:val="center"/>
-              <w:rPr>
-                <w:rFonts w:ascii="仿宋" w:eastAsia="仿宋" w:hAnsi="仿宋" w:cs="仿宋"/>
-                <w:color w:val="000000"/>
-                <w:sz w:val="18"/>
-                <w:szCs w:val="18"/>
-              </w:rPr>
-            </w:pPr>
-            <w:r>
-              <w:rPr>
-                <w:rFonts w:ascii="仿宋" w:eastAsia="仿宋" w:hAnsi="仿宋" w:cs="仿宋" w:hint="eastAsia"/>
-                <w:color w:val="000000"/>
-                <w:sz w:val="18"/>
-                <w:szCs w:val="18"/>
-              </w:rPr>
-              <w:t>1</w:t>
-            </w:r>
-          </w:p>
-        </w:tc>
-        <w:tc>
-          <w:tcPr>
-            <w:tcW w:w="538" w:type="dxa"/>
-            <w:shd w:val="clear" w:color="auto" w:fill="auto"/>
-            <w:noWrap/>
-            <w:vAlign w:val="center"/>
-          </w:tcPr>
-          <w:p>
-            <w:pPr>
-              <w:snapToGrid w:val="0"/>
-              <w:spacing w:line="240" w:lineRule="auto"/>
-              <w:rPr>
-                <w:rFonts w:ascii="仿宋" w:eastAsia="仿宋" w:hAnsi="仿宋" w:cs="仿宋"/>
-                <w:color w:val="000000"/>
-                <w:sz w:val="18"/>
-                <w:szCs w:val="18"/>
-              </w:rPr>
-            </w:pPr>
-          </w:p>
-        </w:tc>
-        <w:tc>
-          <w:tcPr>
-            <w:tcW w:w="961" w:type="dxa"/>
-            <w:shd w:val="clear" w:color="auto" w:fill="auto"/>
-            <w:noWrap/>
-            <w:vAlign w:val="center"/>
-          </w:tcPr>
-          <w:p>
-            <w:pPr>
-              <w:snapToGrid w:val="0"/>
-              <w:spacing w:line="240" w:lineRule="auto"/>
-              <w:rPr>
-                <w:rFonts w:ascii="仿宋" w:eastAsia="仿宋" w:hAnsi="仿宋" w:cs="仿宋"/>
-                <w:color w:val="000000"/>
-                <w:sz w:val="18"/>
-                <w:szCs w:val="18"/>
-              </w:rPr>
-            </w:pPr>
-          </w:p>
-        </w:tc>
-        <w:tc>
-          <w:tcPr>
-            <w:tcW w:w="981" w:type="dxa"/>
-            <w:shd w:val="clear" w:color="auto" w:fill="auto"/>
-            <w:noWrap/>
-            <w:vAlign w:val="center"/>
-          </w:tcPr>
-          <w:p>
-            <w:pPr>
-              <w:snapToGrid w:val="0"/>
-              <w:spacing w:line="240" w:lineRule="auto"/>
-              <w:rPr>
-                <w:rFonts w:ascii="仿宋" w:eastAsia="仿宋" w:hAnsi="仿宋" w:cs="仿宋"/>
-                <w:color w:val="000000"/>
-                <w:sz w:val="18"/>
-                <w:szCs w:val="18"/>
-              </w:rPr>
-            </w:pPr>
-          </w:p>
-        </w:tc>
-        <w:tc>
-          <w:tcPr>
-            <w:tcW w:w="747" w:type="dxa"/>
-            <w:shd w:val="clear" w:color="auto" w:fill="auto"/>
-            <w:noWrap/>
-            <w:vAlign w:val="center"/>
-          </w:tcPr>
-          <w:p>
-            <w:pPr>
-              <w:snapToGrid w:val="0"/>
-              <w:spacing w:line="240" w:lineRule="auto"/>
-              <w:rPr>
-                <w:rFonts w:ascii="仿宋" w:eastAsia="仿宋" w:hAnsi="仿宋" w:cs="仿宋"/>
-                <w:color w:val="000000"/>
-                <w:sz w:val="18"/>
-                <w:szCs w:val="18"/>
-              </w:rPr>
-            </w:pPr>
-          </w:p>
-        </w:tc>
-        <w:tc>
-          <w:tcPr>
-            <w:tcW w:w="747" w:type="dxa"/>
-            <w:shd w:val="clear" w:color="auto" w:fill="auto"/>
-            <w:noWrap/>
-            <w:vAlign w:val="center"/>
-          </w:tcPr>
-          <w:p>
-            <w:pPr>
-              <w:snapToGrid w:val="0"/>
-              <w:spacing w:line="240" w:lineRule="auto"/>
-              <w:rPr>
-                <w:rFonts w:ascii="仿宋" w:eastAsia="仿宋" w:hAnsi="仿宋" w:cs="仿宋"/>
-                <w:color w:val="000000"/>
-                <w:sz w:val="18"/>
-                <w:szCs w:val="18"/>
-              </w:rPr>
-            </w:pPr>
-          </w:p>
-        </w:tc>
-        <w:tc>
-          <w:tcPr>
-            <w:tcW w:w="790" w:type="dxa"/>
-            <w:shd w:val="clear" w:color="auto" w:fill="auto"/>
-            <w:noWrap/>
-            <w:vAlign w:val="center"/>
-          </w:tcPr>
-          <w:p>
-            <w:pPr>
-              <w:snapToGrid w:val="0"/>
-              <w:spacing w:line="240" w:lineRule="auto"/>
-              <w:rPr>
-                <w:rFonts w:ascii="仿宋" w:eastAsia="仿宋" w:hAnsi="仿宋" w:cs="仿宋"/>
-                <w:color w:val="000000"/>
-                <w:sz w:val="18"/>
-                <w:szCs w:val="18"/>
-              </w:rPr>
-            </w:pPr>
-          </w:p>
-        </w:tc>
-        <w:tc>
-          <w:tcPr>
-            <w:tcW w:w="790" w:type="dxa"/>
-            <w:shd w:val="clear" w:color="auto" w:fill="auto"/>
-            <w:noWrap/>
-            <w:vAlign w:val="center"/>
-          </w:tcPr>
-          <w:p>
-            <w:pPr>
-              <w:snapToGrid w:val="0"/>
-              <w:spacing w:line="240" w:lineRule="auto"/>
-              <w:rPr>
-                <w:rFonts w:ascii="仿宋" w:eastAsia="仿宋" w:hAnsi="仿宋" w:cs="仿宋"/>
-                <w:color w:val="000000"/>
-                <w:sz w:val="18"/>
-                <w:szCs w:val="18"/>
-              </w:rPr>
-            </w:pPr>
-          </w:p>
-        </w:tc>
-        <w:tc>
-          <w:tcPr>
-            <w:tcW w:w="771" w:type="dxa"/>
-            <w:shd w:val="clear" w:color="auto" w:fill="auto"/>
-            <w:noWrap/>
-            <w:vAlign w:val="center"/>
-          </w:tcPr>
-          <w:p>
-            <w:pPr>
-              <w:snapToGrid w:val="0"/>
-              <w:spacing w:line="240" w:lineRule="auto"/>
-              <w:rPr>
-                <w:rFonts w:ascii="仿宋" w:eastAsia="仿宋" w:hAnsi="仿宋" w:cs="仿宋"/>
-                <w:color w:val="000000"/>
-                <w:sz w:val="18"/>
-                <w:szCs w:val="18"/>
-              </w:rPr>
-            </w:pPr>
-          </w:p>
-        </w:tc>
-        <w:tc>
-          <w:tcPr>
-            <w:tcW w:w="776" w:type="dxa"/>
-            <w:shd w:val="clear" w:color="auto" w:fill="auto"/>
-            <w:noWrap/>
-            <w:vAlign w:val="center"/>
-          </w:tcPr>
-          <w:p>
-            <w:pPr>
-              <w:snapToGrid w:val="0"/>
-              <w:spacing w:line="240" w:lineRule="auto"/>
-              <w:rPr>
-                <w:rFonts w:ascii="仿宋" w:eastAsia="仿宋" w:hAnsi="仿宋" w:cs="仿宋"/>
-                <w:color w:val="000000"/>
-                <w:sz w:val="18"/>
-                <w:szCs w:val="18"/>
-              </w:rPr>
-            </w:pPr>
-          </w:p>
-        </w:tc>
-        <w:tc>
-          <w:tcPr>
-            <w:tcW w:w="768" w:type="dxa"/>
-            <w:shd w:val="clear" w:color="auto" w:fill="auto"/>
-            <w:noWrap/>
-            <w:vAlign w:val="center"/>
-          </w:tcPr>
-          <w:p>
-            <w:pPr>
-              <w:snapToGrid w:val="0"/>
-              <w:spacing w:line="240" w:lineRule="auto"/>
-              <w:rPr>
-                <w:rFonts w:ascii="仿宋" w:eastAsia="仿宋" w:hAnsi="仿宋" w:cs="仿宋"/>
-                <w:color w:val="000000"/>
-                <w:sz w:val="18"/>
-                <w:szCs w:val="18"/>
-              </w:rPr>
-            </w:pPr>
-          </w:p>
-        </w:tc>
-        <w:tc>
-          <w:tcPr>
-            <w:tcW w:w="768" w:type="dxa"/>
-            <w:shd w:val="clear" w:color="auto" w:fill="auto"/>
-            <w:noWrap/>
-            <w:vAlign w:val="center"/>
-          </w:tcPr>
-          <w:p>
-            <w:pPr>
-              <w:snapToGrid w:val="0"/>
-              <w:spacing w:line="240" w:lineRule="auto"/>
-              <w:rPr>
-                <w:rFonts w:ascii="仿宋" w:eastAsia="仿宋" w:hAnsi="仿宋" w:cs="仿宋"/>
-                <w:color w:val="000000"/>
-                <w:sz w:val="18"/>
-                <w:szCs w:val="18"/>
-              </w:rPr>
-            </w:pPr>
-          </w:p>
-        </w:tc>
-        <w:tc>
-          <w:tcPr>
-            <w:tcW w:w="768" w:type="dxa"/>
-            <w:shd w:val="clear" w:color="auto" w:fill="auto"/>
-            <w:noWrap/>
-            <w:vAlign w:val="center"/>
-          </w:tcPr>
-          <w:p>
-            <w:pPr>
-              <w:snapToGrid w:val="0"/>
-              <w:spacing w:line="240" w:lineRule="auto"/>
-              <w:rPr>
-                <w:rFonts w:ascii="仿宋" w:eastAsia="仿宋" w:hAnsi="仿宋" w:cs="仿宋"/>
-                <w:color w:val="000000"/>
-                <w:sz w:val="18"/>
-                <w:szCs w:val="18"/>
-              </w:rPr>
-            </w:pPr>
-          </w:p>
-        </w:tc>
-        <w:tc>
-          <w:tcPr>
-            <w:tcW w:w="1027" w:type="dxa"/>
-            <w:shd w:val="clear" w:color="auto" w:fill="auto"/>
-            <w:noWrap/>
-            <w:vAlign w:val="center"/>
-          </w:tcPr>
-          <w:p>
-            <w:pPr>
-              <w:snapToGrid w:val="0"/>
-              <w:spacing w:line="240" w:lineRule="auto"/>
-              <w:rPr>
-                <w:rFonts w:ascii="仿宋" w:eastAsia="仿宋" w:hAnsi="仿宋" w:cs="仿宋"/>
-                <w:color w:val="000000"/>
-                <w:sz w:val="18"/>
-                <w:szCs w:val="18"/>
-              </w:rPr>
-            </w:pPr>
-          </w:p>
-        </w:tc>
-        <w:tc>
-          <w:tcPr>
-            <w:tcW w:w="1016" w:type="dxa"/>
-            <w:shd w:val="clear" w:color="auto" w:fill="auto"/>
-            <w:noWrap/>
-            <w:vAlign w:val="center"/>
-          </w:tcPr>
-          <w:p>
-            <w:pPr>
-              <w:snapToGrid w:val="0"/>
-              <w:spacing w:line="240" w:lineRule="auto"/>
-              <w:rPr>
-                <w:rFonts w:ascii="仿宋" w:eastAsia="仿宋" w:hAnsi="仿宋" w:cs="仿宋"/>
-                <w:color w:val="000000"/>
-                <w:sz w:val="18"/>
-                <w:szCs w:val="18"/>
-              </w:rPr>
-            </w:pPr>
-          </w:p>
-        </w:tc>
-        <w:tc>
-          <w:tcPr>
-            <w:tcW w:w="903" w:type="dxa"/>
-            <w:shd w:val="clear" w:color="auto" w:fill="auto"/>
-            <w:vAlign w:val="center"/>
-          </w:tcPr>
-          <w:p>
-            <w:pPr>
-              <w:snapToGrid w:val="0"/>
-              <w:spacing w:line="240" w:lineRule="auto"/>
-              <w:rPr>
-                <w:rFonts w:ascii="仿宋" w:eastAsia="仿宋" w:hAnsi="仿宋" w:cs="仿宋"/>
-                <w:color w:val="000000"/>
-                <w:sz w:val="18"/>
-                <w:szCs w:val="18"/>
-              </w:rPr>
-            </w:pPr>
-          </w:p>
-        </w:tc>
-        <w:tc>
-          <w:tcPr>
-            <w:tcW w:w="780" w:type="dxa"/>
-            <w:shd w:val="clear" w:color="auto" w:fill="auto"/>
-            <w:noWrap/>
-            <w:vAlign w:val="center"/>
-          </w:tcPr>
-          <w:p>
-            <w:pPr>
-              <w:snapToGrid w:val="0"/>
-              <w:spacing w:line="240" w:lineRule="auto"/>
-              <w:rPr>
-                <w:rFonts w:ascii="仿宋" w:eastAsia="仿宋" w:hAnsi="仿宋" w:cs="仿宋"/>
-                <w:color w:val="000000"/>
-                <w:sz w:val="18"/>
-                <w:szCs w:val="18"/>
-              </w:rPr>
-            </w:pPr>
-          </w:p>
-        </w:tc>
-        <w:tc>
-          <w:tcPr>
-            <w:tcW w:w="504" w:type="dxa"/>
-            <w:shd w:val="clear" w:color="auto" w:fill="auto"/>
-            <w:noWrap/>
-            <w:vAlign w:val="center"/>
-          </w:tcPr>
-          <w:p>
-            <w:pPr>
-              <w:snapToGrid w:val="0"/>
-              <w:spacing w:line="240" w:lineRule="auto"/>
-              <w:rPr>
-                <w:rFonts w:ascii="仿宋" w:eastAsia="仿宋" w:hAnsi="仿宋" w:cs="仿宋"/>
-                <w:color w:val="000000"/>
-                <w:sz w:val="18"/>
-                <w:szCs w:val="18"/>
-              </w:rPr>
-            </w:pPr>
-          </w:p>
-        </w:tc>
-      </w:tr>
-      <w:tr>
-        <w:trPr>
-          <w:jc w:val="center"/>
-        </w:trPr>
-        <w:tc>
-          <w:tcPr>
-            <w:tcW w:w="538" w:type="dxa"/>
-            <w:shd w:val="clear" w:color="auto" w:fill="auto"/>
-            <w:noWrap/>
-            <w:vAlign w:val="center"/>
-          </w:tcPr>
-          <w:p>
-            <w:pPr>
-              <w:snapToGrid w:val="0"/>
-              <w:spacing w:line="240" w:lineRule="auto"/>
-              <w:jc w:val="center"/>
-              <w:rPr>
-                <w:rFonts w:ascii="仿宋" w:eastAsia="仿宋" w:hAnsi="仿宋" w:cs="仿宋"/>
-                <w:color w:val="000000"/>
-                <w:sz w:val="18"/>
-                <w:szCs w:val="18"/>
-              </w:rPr>
-            </w:pPr>
-            <w:r>
-              <w:rPr>
-                <w:rFonts w:ascii="仿宋" w:eastAsia="仿宋" w:hAnsi="仿宋" w:cs="仿宋" w:hint="eastAsia"/>
-                <w:color w:val="000000"/>
-                <w:sz w:val="18"/>
-                <w:szCs w:val="18"/>
-              </w:rPr>
-              <w:t>2</w:t>
-            </w:r>
-          </w:p>
-        </w:tc>
-        <w:tc>
-          <w:tcPr>
-            <w:tcW w:w="538" w:type="dxa"/>
-            <w:shd w:val="clear" w:color="auto" w:fill="auto"/>
-            <w:noWrap/>
-            <w:vAlign w:val="center"/>
-          </w:tcPr>
-          <w:p>
-            <w:pPr>
-              <w:snapToGrid w:val="0"/>
-              <w:spacing w:line="240" w:lineRule="auto"/>
-              <w:rPr>
-                <w:rFonts w:ascii="仿宋" w:eastAsia="仿宋" w:hAnsi="仿宋" w:cs="仿宋"/>
-                <w:color w:val="000000"/>
-                <w:sz w:val="18"/>
-                <w:szCs w:val="18"/>
-              </w:rPr>
-            </w:pPr>
-          </w:p>
-        </w:tc>
-        <w:tc>
-          <w:tcPr>
-            <w:tcW w:w="961" w:type="dxa"/>
-            <w:shd w:val="clear" w:color="auto" w:fill="auto"/>
-            <w:noWrap/>
-            <w:vAlign w:val="center"/>
-          </w:tcPr>
-          <w:p>
-            <w:pPr>
-              <w:snapToGrid w:val="0"/>
-              <w:spacing w:line="240" w:lineRule="auto"/>
-              <w:rPr>
-                <w:rFonts w:ascii="仿宋" w:eastAsia="仿宋" w:hAnsi="仿宋" w:cs="仿宋"/>
-                <w:color w:val="000000"/>
-                <w:sz w:val="18"/>
-                <w:szCs w:val="18"/>
-              </w:rPr>
-            </w:pPr>
-          </w:p>
-        </w:tc>
-        <w:tc>
-          <w:tcPr>
-            <w:tcW w:w="981" w:type="dxa"/>
-            <w:shd w:val="clear" w:color="auto" w:fill="auto"/>
-            <w:noWrap/>
-            <w:vAlign w:val="center"/>
-          </w:tcPr>
-          <w:p>
-            <w:pPr>
-              <w:snapToGrid w:val="0"/>
-              <w:spacing w:line="240" w:lineRule="auto"/>
-              <w:rPr>
-                <w:rFonts w:ascii="仿宋" w:eastAsia="仿宋" w:hAnsi="仿宋" w:cs="仿宋"/>
-                <w:color w:val="000000"/>
-                <w:sz w:val="18"/>
-                <w:szCs w:val="18"/>
-              </w:rPr>
-            </w:pPr>
-          </w:p>
-        </w:tc>
-        <w:tc>
-          <w:tcPr>
-            <w:tcW w:w="747" w:type="dxa"/>
-            <w:shd w:val="clear" w:color="auto" w:fill="auto"/>
-            <w:noWrap/>
-            <w:vAlign w:val="center"/>
-          </w:tcPr>
-          <w:p>
-            <w:pPr>
-              <w:snapToGrid w:val="0"/>
-              <w:spacing w:line="240" w:lineRule="auto"/>
-              <w:rPr>
-                <w:rFonts w:ascii="仿宋" w:eastAsia="仿宋" w:hAnsi="仿宋" w:cs="仿宋"/>
-                <w:color w:val="000000"/>
-                <w:sz w:val="18"/>
-                <w:szCs w:val="18"/>
-              </w:rPr>
-            </w:pPr>
-          </w:p>
-        </w:tc>
-        <w:tc>
-          <w:tcPr>
-            <w:tcW w:w="747" w:type="dxa"/>
-            <w:shd w:val="clear" w:color="auto" w:fill="auto"/>
-            <w:noWrap/>
-            <w:vAlign w:val="center"/>
-          </w:tcPr>
-          <w:p>
-            <w:pPr>
-              <w:snapToGrid w:val="0"/>
-              <w:spacing w:line="240" w:lineRule="auto"/>
-              <w:rPr>
-                <w:rFonts w:ascii="仿宋" w:eastAsia="仿宋" w:hAnsi="仿宋" w:cs="仿宋"/>
-                <w:color w:val="000000"/>
-                <w:sz w:val="18"/>
-                <w:szCs w:val="18"/>
-              </w:rPr>
-            </w:pPr>
-          </w:p>
-        </w:tc>
-        <w:tc>
-          <w:tcPr>
-            <w:tcW w:w="790" w:type="dxa"/>
-            <w:shd w:val="clear" w:color="auto" w:fill="auto"/>
-            <w:noWrap/>
-            <w:vAlign w:val="center"/>
-          </w:tcPr>
-          <w:p>
-            <w:pPr>
-              <w:snapToGrid w:val="0"/>
-              <w:spacing w:line="240" w:lineRule="auto"/>
-              <w:rPr>
-                <w:rFonts w:ascii="仿宋" w:eastAsia="仿宋" w:hAnsi="仿宋" w:cs="仿宋"/>
-                <w:color w:val="000000"/>
-                <w:sz w:val="18"/>
-                <w:szCs w:val="18"/>
-              </w:rPr>
-            </w:pPr>
-          </w:p>
-        </w:tc>
-        <w:tc>
-          <w:tcPr>
-            <w:tcW w:w="790" w:type="dxa"/>
-            <w:shd w:val="clear" w:color="auto" w:fill="auto"/>
-            <w:noWrap/>
-            <w:vAlign w:val="center"/>
-          </w:tcPr>
-          <w:p>
-            <w:pPr>
-              <w:snapToGrid w:val="0"/>
-              <w:spacing w:line="240" w:lineRule="auto"/>
-              <w:rPr>
-                <w:rFonts w:ascii="仿宋" w:eastAsia="仿宋" w:hAnsi="仿宋" w:cs="仿宋"/>
-                <w:color w:val="000000"/>
-                <w:sz w:val="18"/>
-                <w:szCs w:val="18"/>
-              </w:rPr>
-            </w:pPr>
-          </w:p>
-        </w:tc>
-        <w:tc>
-          <w:tcPr>
-            <w:tcW w:w="771" w:type="dxa"/>
-            <w:shd w:val="clear" w:color="auto" w:fill="auto"/>
-            <w:noWrap/>
-            <w:vAlign w:val="center"/>
-          </w:tcPr>
-          <w:p>
-            <w:pPr>
-              <w:snapToGrid w:val="0"/>
-              <w:spacing w:line="240" w:lineRule="auto"/>
-              <w:rPr>
-                <w:rFonts w:ascii="仿宋" w:eastAsia="仿宋" w:hAnsi="仿宋" w:cs="仿宋"/>
-                <w:color w:val="000000"/>
-                <w:sz w:val="18"/>
-                <w:szCs w:val="18"/>
-              </w:rPr>
-            </w:pPr>
-          </w:p>
-        </w:tc>
-        <w:tc>
-          <w:tcPr>
-            <w:tcW w:w="776" w:type="dxa"/>
-            <w:shd w:val="clear" w:color="auto" w:fill="auto"/>
-            <w:noWrap/>
-            <w:vAlign w:val="center"/>
-          </w:tcPr>
-          <w:p>
-            <w:pPr>
-              <w:snapToGrid w:val="0"/>
-              <w:spacing w:line="240" w:lineRule="auto"/>
-              <w:rPr>
-                <w:rFonts w:ascii="仿宋" w:eastAsia="仿宋" w:hAnsi="仿宋" w:cs="仿宋"/>
-                <w:color w:val="000000"/>
-                <w:sz w:val="18"/>
-                <w:szCs w:val="18"/>
-              </w:rPr>
-            </w:pPr>
-          </w:p>
-        </w:tc>
-        <w:tc>
-          <w:tcPr>
-            <w:tcW w:w="768" w:type="dxa"/>
-            <w:shd w:val="clear" w:color="auto" w:fill="auto"/>
-            <w:noWrap/>
-            <w:vAlign w:val="center"/>
-          </w:tcPr>
-          <w:p>
-            <w:pPr>
-              <w:snapToGrid w:val="0"/>
-              <w:spacing w:line="240" w:lineRule="auto"/>
-              <w:rPr>
-                <w:rFonts w:ascii="仿宋" w:eastAsia="仿宋" w:hAnsi="仿宋" w:cs="仿宋"/>
-                <w:color w:val="000000"/>
-                <w:sz w:val="18"/>
-                <w:szCs w:val="18"/>
-              </w:rPr>
-            </w:pPr>
-          </w:p>
-        </w:tc>
-        <w:tc>
-          <w:tcPr>
-            <w:tcW w:w="768" w:type="dxa"/>
-            <w:shd w:val="clear" w:color="auto" w:fill="auto"/>
-            <w:noWrap/>
-            <w:vAlign w:val="center"/>
-          </w:tcPr>
-          <w:p>
-            <w:pPr>
-              <w:snapToGrid w:val="0"/>
-              <w:spacing w:line="240" w:lineRule="auto"/>
-              <w:rPr>
-                <w:rFonts w:ascii="仿宋" w:eastAsia="仿宋" w:hAnsi="仿宋" w:cs="仿宋"/>
-                <w:color w:val="000000"/>
-                <w:sz w:val="18"/>
-                <w:szCs w:val="18"/>
-              </w:rPr>
-            </w:pPr>
-          </w:p>
-        </w:tc>
-        <w:tc>
-          <w:tcPr>
-            <w:tcW w:w="768" w:type="dxa"/>
-            <w:shd w:val="clear" w:color="auto" w:fill="auto"/>
-            <w:noWrap/>
-            <w:vAlign w:val="center"/>
-          </w:tcPr>
-          <w:p>
-            <w:pPr>
-              <w:snapToGrid w:val="0"/>
-              <w:spacing w:line="240" w:lineRule="auto"/>
-              <w:rPr>
-                <w:rFonts w:ascii="仿宋" w:eastAsia="仿宋" w:hAnsi="仿宋" w:cs="仿宋"/>
-                <w:color w:val="000000"/>
-                <w:sz w:val="18"/>
-                <w:szCs w:val="18"/>
-              </w:rPr>
-            </w:pPr>
-          </w:p>
-        </w:tc>
-        <w:tc>
-          <w:tcPr>
-            <w:tcW w:w="1027" w:type="dxa"/>
-            <w:shd w:val="clear" w:color="auto" w:fill="auto"/>
-            <w:noWrap/>
-            <w:vAlign w:val="center"/>
-          </w:tcPr>
-          <w:p>
-            <w:pPr>
-              <w:snapToGrid w:val="0"/>
-              <w:spacing w:line="240" w:lineRule="auto"/>
-              <w:rPr>
-                <w:rFonts w:ascii="仿宋" w:eastAsia="仿宋" w:hAnsi="仿宋" w:cs="仿宋"/>
-                <w:color w:val="000000"/>
-                <w:sz w:val="18"/>
-                <w:szCs w:val="18"/>
-              </w:rPr>
-            </w:pPr>
-          </w:p>
-        </w:tc>
-        <w:tc>
-          <w:tcPr>
-            <w:tcW w:w="1016" w:type="dxa"/>
-            <w:shd w:val="clear" w:color="auto" w:fill="auto"/>
-            <w:noWrap/>
-            <w:vAlign w:val="center"/>
-          </w:tcPr>
-          <w:p>
-            <w:pPr>
-              <w:snapToGrid w:val="0"/>
-              <w:spacing w:line="240" w:lineRule="auto"/>
-              <w:rPr>
-                <w:rFonts w:ascii="仿宋" w:eastAsia="仿宋" w:hAnsi="仿宋" w:cs="仿宋"/>
-                <w:color w:val="000000"/>
-                <w:sz w:val="18"/>
-                <w:szCs w:val="18"/>
-              </w:rPr>
-            </w:pPr>
-          </w:p>
-        </w:tc>
-        <w:tc>
-          <w:tcPr>
-            <w:tcW w:w="903" w:type="dxa"/>
-            <w:shd w:val="clear" w:color="auto" w:fill="auto"/>
-            <w:vAlign w:val="center"/>
-          </w:tcPr>
-          <w:p>
-            <w:pPr>
-              <w:snapToGrid w:val="0"/>
-              <w:spacing w:line="240" w:lineRule="auto"/>
-              <w:rPr>
-                <w:rFonts w:ascii="仿宋" w:eastAsia="仿宋" w:hAnsi="仿宋" w:cs="仿宋"/>
-                <w:color w:val="000000"/>
-                <w:sz w:val="18"/>
-                <w:szCs w:val="18"/>
-              </w:rPr>
-            </w:pPr>
-          </w:p>
-        </w:tc>
-        <w:tc>
-          <w:tcPr>
-            <w:tcW w:w="780" w:type="dxa"/>
-            <w:shd w:val="clear" w:color="auto" w:fill="auto"/>
-            <w:noWrap/>
-            <w:vAlign w:val="center"/>
-          </w:tcPr>
-          <w:p>
-            <w:pPr>
-              <w:snapToGrid w:val="0"/>
-              <w:spacing w:line="240" w:lineRule="auto"/>
-              <w:rPr>
-                <w:rFonts w:ascii="仿宋" w:eastAsia="仿宋" w:hAnsi="仿宋" w:cs="仿宋"/>
-                <w:color w:val="000000"/>
-                <w:sz w:val="18"/>
-                <w:szCs w:val="18"/>
-              </w:rPr>
-            </w:pPr>
-          </w:p>
-        </w:tc>
-        <w:tc>
-          <w:tcPr>
-            <w:tcW w:w="504" w:type="dxa"/>
-            <w:shd w:val="clear" w:color="auto" w:fill="auto"/>
-            <w:noWrap/>
-            <w:vAlign w:val="center"/>
-          </w:tcPr>
-          <w:p>
-            <w:pPr>
-              <w:snapToGrid w:val="0"/>
-              <w:spacing w:line="240" w:lineRule="auto"/>
-              <w:rPr>
-                <w:rFonts w:ascii="仿宋" w:eastAsia="仿宋" w:hAnsi="仿宋" w:cs="仿宋"/>
-                <w:color w:val="000000"/>
-                <w:sz w:val="18"/>
-                <w:szCs w:val="18"/>
-              </w:rPr>
-            </w:pPr>
-          </w:p>
-        </w:tc>
-      </w:tr>
-      <w:bookmarkEnd w:id="1"/>
-    </w:tbl>
-    <w:p>
-      <w:pPr>
-        <w:pStyle w:val="a4"/>
-        <w:spacing w:after="0" w:line="560" w:lineRule="exact"/>
-        <w:ind w:firstLineChars="200" w:firstLine="640"/>
-        <w:rPr>
-          <w:rFonts w:ascii="楷体_GB2312" w:eastAsia="楷体_GB2312" w:hAnsi="楷体_GB2312" w:cs="楷体_GB2312"/>
-          <w:b/>
-          <w:bCs/>
-          <w:color w:val="000000"/>
-          <w:kern w:val="0"/>
-          <w:sz w:val="32"/>
-          <w:szCs w:val="32"/>
-          <w:lang w:bidi="ar"/>
-        </w:rPr>
-      </w:pPr>
-    </w:p>
-    <w:p>
-      <w:pPr>
-        <w:widowControl/>
-        <w:spacing w:line="560" w:lineRule="exact"/>
-        <w:ind w:firstLineChars="200" w:firstLine="420"/>
-        <w:rPr>
-          <w:rFonts w:ascii="Times New Roman" w:hAnsi="Times New Roman" w:cs="Times New Roman"/>
-        </w:rPr>
-        <w:sectPr>
-          <w:footerReference w:type="default" r:id="rId9"/>
-          <w:pgSz w:w="16838" w:h="11906" w:orient="landscape"/>
-          <w:pgMar w:top="1800" w:right="1440" w:bottom="1800" w:left="1440" w:header="851" w:footer="992" w:gutter="0"/>
-          <w:pgNumType w:fmt="numberInDash"/>
-          <w:cols w:space="425"/>
-          <w:docGrid w:type="lines" w:linePitch="312"/>
-        </w:sectPr>
-      </w:pPr>
-    </w:p>
-    <w:p>
-      <w:pPr>
-        <w:widowControl/>
-        <w:spacing w:line="560" w:lineRule="exact"/>
-        <w:rPr>
-          <w:rFonts w:ascii="Times New Roman" w:eastAsia="仿宋_GB2312" w:hAnsi="Times New Roman" w:cs="Times New Roman"/>
-          <w:sz w:val="32"/>
-          <w:szCs w:val="32"/>
-        </w:rPr>
-      </w:pPr>
-    </w:p>
-    <w:p>
-      <w:pPr>
-        <w:widowControl/>
-        <w:spacing w:line="560" w:lineRule="exact"/>
-        <w:ind w:firstLineChars="200" w:firstLine="640"/>
-        <w:rPr>
-          <w:rFonts w:ascii="Times New Roman" w:eastAsia="仿宋_GB2312" w:hAnsi="Times New Roman" w:cs="Times New Roman"/>
-          <w:sz w:val="32"/>
-          <w:szCs w:val="32"/>
-        </w:rPr>
-      </w:pPr>
-    </w:p>
-    <w:p>
-      <w:pPr>
-        <w:widowControl/>
-        <w:spacing w:line="560" w:lineRule="exact"/>
-        <w:ind w:firstLineChars="200" w:firstLine="640"/>
-        <w:rPr>
-          <w:rFonts w:ascii="Times New Roman" w:eastAsia="仿宋_GB2312" w:hAnsi="Times New Roman" w:cs="Times New Roman"/>
-          <w:sz w:val="32"/>
-          <w:szCs w:val="32"/>
-        </w:rPr>
-      </w:pPr>
-    </w:p>
-    <w:p>
-      <w:pPr>
-        <w:widowControl/>
-        <w:spacing w:line="560" w:lineRule="exact"/>
-        <w:ind w:firstLineChars="200" w:firstLine="640"/>
-        <w:rPr>
-          <w:rFonts w:ascii="Times New Roman" w:eastAsia="仿宋_GB2312" w:hAnsi="Times New Roman" w:cs="Times New Roman"/>
-          <w:sz w:val="32"/>
-          <w:szCs w:val="32"/>
-        </w:rPr>
-      </w:pPr>
-    </w:p>
-    <w:p>
-      <w:pPr>
-        <w:widowControl/>
-        <w:spacing w:line="560" w:lineRule="exact"/>
-        <w:ind w:firstLineChars="200" w:firstLine="640"/>
-        <w:rPr>
-          <w:rFonts w:ascii="Times New Roman" w:eastAsia="仿宋_GB2312" w:hAnsi="Times New Roman" w:cs="Times New Roman"/>
-          <w:sz w:val="32"/>
-          <w:szCs w:val="32"/>
-        </w:rPr>
-      </w:pPr>
-    </w:p>
-    <w:p>
-      <w:pPr>
-        <w:widowControl/>
-        <w:spacing w:line="560" w:lineRule="exact"/>
-        <w:ind w:firstLineChars="200" w:firstLine="640"/>
-        <w:rPr>
-          <w:rFonts w:ascii="Times New Roman" w:eastAsia="仿宋_GB2312" w:hAnsi="Times New Roman" w:cs="Times New Roman"/>
-          <w:sz w:val="32"/>
-          <w:szCs w:val="32"/>
-        </w:rPr>
-      </w:pPr>
-    </w:p>
-    <w:p>
-      <w:pPr>
-        <w:widowControl/>
-        <w:spacing w:line="560" w:lineRule="exact"/>
-        <w:ind w:firstLineChars="200" w:firstLine="640"/>
-        <w:rPr>
-          <w:rFonts w:ascii="Times New Roman" w:eastAsia="仿宋_GB2312" w:hAnsi="Times New Roman" w:cs="Times New Roman"/>
-          <w:sz w:val="32"/>
-          <w:szCs w:val="32"/>
-        </w:rPr>
-      </w:pPr>
-    </w:p>
-    <w:p>
-      <w:pPr>
-        <w:widowControl/>
-        <w:spacing w:line="560" w:lineRule="exact"/>
-        <w:ind w:firstLineChars="200" w:firstLine="640"/>
-        <w:rPr>
-          <w:rFonts w:ascii="Times New Roman" w:eastAsia="仿宋_GB2312" w:hAnsi="Times New Roman" w:cs="Times New Roman"/>
-          <w:sz w:val="32"/>
-          <w:szCs w:val="32"/>
-        </w:rPr>
-      </w:pPr>
-    </w:p>
-    <w:p>
-      <w:pPr>
-        <w:widowControl/>
-        <w:spacing w:line="560" w:lineRule="exact"/>
-        <w:ind w:firstLineChars="200" w:firstLine="640"/>
-        <w:rPr>
-          <w:rFonts w:ascii="Times New Roman" w:eastAsia="仿宋_GB2312" w:hAnsi="Times New Roman" w:cs="Times New Roman"/>
-          <w:sz w:val="32"/>
-          <w:szCs w:val="32"/>
-        </w:rPr>
-      </w:pPr>
-    </w:p>
-    <w:p>
-      <w:pPr>
-        <w:widowControl/>
-        <w:spacing w:line="560" w:lineRule="exact"/>
-        <w:ind w:firstLineChars="200" w:firstLine="640"/>
-        <w:rPr>
-          <w:rFonts w:ascii="Times New Roman" w:eastAsia="仿宋_GB2312" w:hAnsi="Times New Roman" w:cs="Times New Roman"/>
-          <w:sz w:val="32"/>
-          <w:szCs w:val="32"/>
-        </w:rPr>
-      </w:pPr>
-    </w:p>
-    <w:p>
-      <w:pPr>
-        <w:widowControl/>
-        <w:spacing w:line="560" w:lineRule="exact"/>
-        <w:ind w:firstLineChars="200" w:firstLine="640"/>
-        <w:rPr>
-          <w:rFonts w:ascii="Times New Roman" w:eastAsia="仿宋_GB2312" w:hAnsi="Times New Roman" w:cs="Times New Roman"/>
-          <w:sz w:val="32"/>
-          <w:szCs w:val="32"/>
-        </w:rPr>
-      </w:pPr>
-    </w:p>
-    <w:p>
-      <w:pPr>
-        <w:widowControl/>
-        <w:spacing w:line="560" w:lineRule="exact"/>
-        <w:ind w:firstLineChars="200" w:firstLine="640"/>
-        <w:rPr>
-          <w:rFonts w:ascii="Times New Roman" w:eastAsia="仿宋_GB2312" w:hAnsi="Times New Roman" w:cs="Times New Roman"/>
-          <w:sz w:val="32"/>
-          <w:szCs w:val="32"/>
-        </w:rPr>
-      </w:pPr>
-    </w:p>
-    <w:bookmarkStart w:id="5" w:name="_Hlk132899821"/>
-    <w:bookmarkEnd w:id="2"/>
-    <w:bookmarkEnd w:id="3"/>
-    <w:bookmarkEnd w:id="4"/>
     <w:p>
       <w:pPr>
         <w:spacing w:after="0" w:line="560" w:lineRule="exact"/>

</xml_diff>